<commit_message>
Revise Exam One: 10 tweaks before exam week
- Q3: replace with adjective gradeability question (comp/superlative test)
- Q8: replace with S → NP + VP sentence structure question
- Q18: repeat sentence from Q17 for clarity
- Q24: new — PP modifying object of another PP
- Q25: new — adverb modifying adjective
- Section B: remove bracket notation requirement; students now create
  a tree diagram using tool of their choice (SyntaxTreeHybrid / paper / tablet)
- Scoring updated: bracket notation → tree diagram (2 pts)
- Abbreviation key: fix alignment (ADJ→ADJP, ADV→ADVP now in same row)
- Q26: add "on her comfy bed" (harder sentence); regenerate diagram
- Bonus: B1 add free morpheme ID; B2 change to VP-modifying PP;
  B5 replace structural ambiguity with adverb-modifies-adjective task

Co-Authored-By: Claude Sonnet 4.6 <noreply@anthropic.com>
</commit_message>
<xml_diff>
--- a/Homework/Exams/ENGL 3110 - S26 - Exam One - Answer Key.docx
+++ b/Homework/Exams/ENGL 3110 - S26 - Exam One - Answer Key.docx
@@ -347,7 +347,7 @@
         <w:rPr>
           <w:sz w:val="22"/>
         </w:rPr>
-        <w:t>Which of the following is a bound morpheme?</w:t>
+        <w:t>Which test reliably distinguishes adjectives from determiners?</w:t>
       </w:r>
       <w:r>
         <w:rPr>
@@ -373,7 +373,7 @@
           <w:b/>
           <w:sz w:val="22"/>
         </w:rPr>
-        <w:t>c</w:t>
+        <w:t>b</w:t>
       </w:r>
     </w:p>
     <w:p>
@@ -385,14 +385,14 @@
         <w:rPr>
           <w:sz w:val="22"/>
         </w:rPr>
-        <w:t>a. book</w:t>
+        <w:t>a. Adjectives can be pluralized</w:t>
       </w:r>
       <w:r>
         <w:rPr>
           <w:i/>
           <w:sz w:val="20"/>
         </w:rPr>
-        <w:t xml:space="preserve"> — free morpheme (can stand alone)</w:t>
+        <w:t xml:space="preserve"> — Incorrect. Nouns are pluralized, not adjectives.</w:t>
       </w:r>
     </w:p>
     <w:p>
@@ -402,16 +402,17 @@
       </w:pPr>
       <w:r>
         <w:rPr>
+          <w:b/>
           <w:sz w:val="22"/>
         </w:rPr>
-        <w:t>b. happy</w:t>
+        <w:t>b. Adjectives can be “gradeable” — they have comparative and superlative forms (e.g., taller/tallest or more challenging/most challenging)</w:t>
       </w:r>
       <w:r>
         <w:rPr>
           <w:i/>
           <w:sz w:val="20"/>
         </w:rPr>
-        <w:t xml:space="preserve"> — free morpheme (can stand alone)</w:t>
+        <w:t xml:space="preserve"> — Correct. Determiners do not have comparative or superlative forms: you cannot say "taller the" or "more the."</w:t>
       </w:r>
     </w:p>
     <w:p>
@@ -421,17 +422,123 @@
       </w:pPr>
       <w:r>
         <w:rPr>
+          <w:sz w:val="22"/>
+        </w:rPr>
+        <w:t>c. Adjectives always appear after the noun</w:t>
+      </w:r>
+      <w:r>
+        <w:rPr>
+          <w:i/>
+          <w:sz w:val="20"/>
+        </w:rPr>
+        <w:t xml:space="preserve"> — Incorrect. Adjectives typically appear before the noun in attributive position.</w:t>
+      </w:r>
+    </w:p>
+    <w:p>
+      <w:pPr>
+        <w:spacing w:before="20" w:after="20"/>
+        <w:ind w:left="720"/>
+      </w:pPr>
+      <w:r>
+        <w:rPr>
+          <w:sz w:val="22"/>
+        </w:rPr>
+        <w:t>d. Adjectives cannot appear before nouns</w:t>
+      </w:r>
+      <w:r>
+        <w:rPr>
+          <w:i/>
+          <w:sz w:val="20"/>
+        </w:rPr>
+        <w:t xml:space="preserve"> — Incorrect. Adjectives routinely appear before nouns (the tall man).</w:t>
+      </w:r>
+    </w:p>
+    <w:p>
+      <w:pPr>
+        <w:spacing w:before="120" w:after="40"/>
+      </w:pPr>
+      <w:r>
+        <w:rPr>
           <w:b/>
           <w:sz w:val="22"/>
         </w:rPr>
-        <w:t>c. -ness</w:t>
+        <w:t xml:space="preserve">Question 4: </w:t>
+      </w:r>
+      <w:r>
+        <w:rPr>
+          <w:sz w:val="22"/>
+        </w:rPr>
+        <w:t>The suffix -tion typically creates which word class?</w:t>
+      </w:r>
+      <w:r>
+        <w:rPr>
+          <w:sz w:val="22"/>
+        </w:rPr>
+        <w:t xml:space="preserve"> (2 pts)</w:t>
+      </w:r>
+    </w:p>
+    <w:p>
+      <w:pPr>
+        <w:spacing w:before="40" w:after="40"/>
+        <w:ind w:left="432"/>
+      </w:pPr>
+      <w:r>
+        <w:rPr>
+          <w:b/>
+          <w:sz w:val="22"/>
+        </w:rPr>
+        <w:t xml:space="preserve">Answer: </w:t>
+      </w:r>
+      <w:r>
+        <w:rPr>
+          <w:b/>
+          <w:sz w:val="22"/>
+        </w:rPr>
+        <w:t>c</w:t>
+      </w:r>
+    </w:p>
+    <w:p>
+      <w:pPr>
+        <w:spacing w:before="20" w:after="20"/>
+        <w:ind w:left="720"/>
+      </w:pPr>
+      <w:r>
+        <w:rPr>
+          <w:sz w:val="22"/>
+        </w:rPr>
+        <w:t>a. Verb</w:t>
+      </w:r>
+    </w:p>
+    <w:p>
+      <w:pPr>
+        <w:spacing w:before="20" w:after="20"/>
+        <w:ind w:left="720"/>
+      </w:pPr>
+      <w:r>
+        <w:rPr>
+          <w:sz w:val="22"/>
+        </w:rPr>
+        <w:t>b. Adjective</w:t>
+      </w:r>
+    </w:p>
+    <w:p>
+      <w:pPr>
+        <w:spacing w:before="20" w:after="20"/>
+        <w:ind w:left="720"/>
+      </w:pPr>
+      <w:r>
+        <w:rPr>
+          <w:b/>
+          <w:sz w:val="22"/>
+        </w:rPr>
+        <w:t>c. Noun</w:t>
       </w:r>
       <w:r>
         <w:rPr>
           <w:i/>
           <w:sz w:val="20"/>
         </w:rPr>
-        <w:t xml:space="preserve"> — bound morpheme (cannot stand alone; must attach to another morpheme)</w:t>
+        <w:t xml:space="preserve"> — -tion converts verbs into nouns: action, creation, decision</w:t>
       </w:r>
     </w:p>
     <w:p>
@@ -443,42 +550,156 @@
         <w:rPr>
           <w:sz w:val="22"/>
         </w:rPr>
-        <w:t>d. walk</w:t>
+        <w:t>d. Adverb</w:t>
+      </w:r>
+    </w:p>
+    <w:p>
+      <w:pPr>
+        <w:spacing w:before="120" w:after="40"/>
+      </w:pPr>
+      <w:r>
+        <w:rPr>
+          <w:b/>
+          <w:sz w:val="22"/>
+        </w:rPr>
+        <w:t xml:space="preserve">Question 5: </w:t>
+      </w:r>
+      <w:r>
+        <w:rPr>
+          <w:sz w:val="22"/>
+        </w:rPr>
+        <w:t>Which word is an example of a compound (formed from two free morphemes)?</w:t>
+      </w:r>
+      <w:r>
+        <w:rPr>
+          <w:sz w:val="22"/>
+        </w:rPr>
+        <w:t xml:space="preserve"> (2 pts)</w:t>
+      </w:r>
+    </w:p>
+    <w:p>
+      <w:pPr>
+        <w:spacing w:before="40" w:after="40"/>
+        <w:ind w:left="432"/>
+      </w:pPr>
+      <w:r>
+        <w:rPr>
+          <w:b/>
+          <w:sz w:val="22"/>
+        </w:rPr>
+        <w:t xml:space="preserve">Answer: </w:t>
+      </w:r>
+      <w:r>
+        <w:rPr>
+          <w:b/>
+          <w:sz w:val="22"/>
+        </w:rPr>
+        <w:t>c</w:t>
+      </w:r>
+    </w:p>
+    <w:p>
+      <w:pPr>
+        <w:spacing w:before="20" w:after="20"/>
+        <w:ind w:left="720"/>
+      </w:pPr>
+      <w:r>
+        <w:rPr>
+          <w:sz w:val="22"/>
+        </w:rPr>
+        <w:t>a. understand</w:t>
       </w:r>
       <w:r>
         <w:rPr>
           <w:i/>
           <w:sz w:val="20"/>
         </w:rPr>
-        <w:t xml:space="preserve"> — free morpheme (can stand alone)</w:t>
+        <w:t xml:space="preserve"> — 1 morpheme. The meaning does not derive from "under" + "stand."</w:t>
       </w:r>
     </w:p>
     <w:p>
       <w:pPr>
-        <w:spacing w:before="120" w:after="40"/>
+        <w:spacing w:before="20" w:after="20"/>
+        <w:ind w:left="720"/>
+      </w:pPr>
+      <w:r>
+        <w:rPr>
+          <w:sz w:val="22"/>
+        </w:rPr>
+        <w:t>b. carpet</w:t>
+      </w:r>
+      <w:r>
+        <w:rPr>
+          <w:i/>
+          <w:sz w:val="20"/>
+        </w:rPr>
+        <w:t xml:space="preserve"> — 1 morpheme. "Car" + "pet" is coincidental resemblance.</w:t>
+      </w:r>
+    </w:p>
+    <w:p>
+      <w:pPr>
+        <w:spacing w:before="20" w:after="20"/>
+        <w:ind w:left="720"/>
       </w:pPr>
       <w:r>
         <w:rPr>
           <w:b/>
           <w:sz w:val="22"/>
         </w:rPr>
-        <w:t xml:space="preserve">Question 4: </w:t>
-      </w:r>
-      <w:r>
-        <w:rPr>
-          <w:sz w:val="22"/>
-        </w:rPr>
-        <w:t>The suffix -tion typically creates which word class?</w:t>
-      </w:r>
-      <w:r>
-        <w:rPr>
-          <w:sz w:val="22"/>
-        </w:rPr>
-        <w:t xml:space="preserve"> (2 pts)</w:t>
+        <w:t>c. bookcase</w:t>
+      </w:r>
+      <w:r>
+        <w:rPr>
+          <w:i/>
+          <w:sz w:val="20"/>
+        </w:rPr>
+        <w:t xml:space="preserve"> — 2 free morphemes: book + case. The meaning is compositional.</w:t>
       </w:r>
     </w:p>
     <w:p>
       <w:pPr>
+        <w:spacing w:before="20" w:after="20"/>
+        <w:ind w:left="720"/>
+      </w:pPr>
+      <w:r>
+        <w:rPr>
+          <w:sz w:val="22"/>
+        </w:rPr>
+        <w:t>d. receive</w:t>
+      </w:r>
+      <w:r>
+        <w:rPr>
+          <w:i/>
+          <w:sz w:val="20"/>
+        </w:rPr>
+        <w:t xml:space="preserve"> — 1 morpheme. "Ceive" is not a word in modern English.</w:t>
+      </w:r>
+    </w:p>
+    <w:p>
+      <w:pPr>
+        <w:spacing w:before="120" w:after="40"/>
+      </w:pPr>
+      <w:r>
+        <w:rPr>
+          <w:b/>
+          <w:sz w:val="22"/>
+        </w:rPr>
+        <w:t xml:space="preserve">Question 6: </w:t>
+      </w:r>
+      <w:r>
+        <w:rPr>
+          <w:sz w:val="22"/>
+        </w:rPr>
+        <w:t>The word "unhelpful" contains how many morphemes?</w:t>
+      </w:r>
+      <w:r>
+        <w:rPr>
+          <w:sz w:val="22"/>
+        </w:rPr>
+        <w:t xml:space="preserve"> (2 pts)</w:t>
+      </w:r>
+    </w:p>
+    <w:p>
+      <w:pPr>
         <w:spacing w:before="40" w:after="40"/>
         <w:ind w:left="432"/>
       </w:pPr>
@@ -506,7 +727,7 @@
         <w:rPr>
           <w:sz w:val="22"/>
         </w:rPr>
-        <w:t>a. Verb</w:t>
+        <w:t>a. 1</w:t>
       </w:r>
     </w:p>
     <w:p>
@@ -518,7 +739,7 @@
         <w:rPr>
           <w:sz w:val="22"/>
         </w:rPr>
-        <w:t>b. Adjective</w:t>
+        <w:t>b. 2</w:t>
       </w:r>
     </w:p>
     <w:p>
@@ -531,14 +752,14 @@
           <w:b/>
           <w:sz w:val="22"/>
         </w:rPr>
-        <w:t>c. Noun</w:t>
+        <w:t>c. 3</w:t>
       </w:r>
       <w:r>
         <w:rPr>
           <w:i/>
           <w:sz w:val="20"/>
         </w:rPr>
-        <w:t xml:space="preserve"> — -tion converts verbs into nouns: action, creation, decision</w:t>
+        <w:t xml:space="preserve"> — un- (bound) + help (free) + -ful (bound)</w:t>
       </w:r>
     </w:p>
     <w:p>
@@ -550,7 +771,7 @@
         <w:rPr>
           <w:sz w:val="22"/>
         </w:rPr>
-        <w:t>d. Adverb</w:t>
+        <w:t>d. 4</w:t>
       </w:r>
     </w:p>
     <w:p>
@@ -562,13 +783,13 @@
           <w:b/>
           <w:sz w:val="22"/>
         </w:rPr>
-        <w:t xml:space="preserve">Question 5: </w:t>
+        <w:t xml:space="preserve">Question 7: </w:t>
       </w:r>
       <w:r>
         <w:rPr>
           <w:sz w:val="22"/>
         </w:rPr>
-        <w:t>Which word is an example of a compound (formed from two free morphemes)?</w:t>
+        <w:t>Which of the following correctly identifies the morphemes in "rebuilding"?</w:t>
       </w:r>
       <w:r>
         <w:rPr>
@@ -594,7 +815,7 @@
           <w:b/>
           <w:sz w:val="22"/>
         </w:rPr>
-        <w:t>c</w:t>
+        <w:t>a</w:t>
       </w:r>
     </w:p>
     <w:p>
@@ -604,16 +825,17 @@
       </w:pPr>
       <w:r>
         <w:rPr>
+          <w:b/>
           <w:sz w:val="22"/>
         </w:rPr>
-        <w:t>a. understand</w:t>
+        <w:t>a. re- (bound) + build (free) + -ing (bound)</w:t>
       </w:r>
       <w:r>
         <w:rPr>
           <w:i/>
           <w:sz w:val="20"/>
         </w:rPr>
-        <w:t xml:space="preserve"> — 1 morpheme. The meaning does not derive from "under" + "stand."</w:t>
+        <w:t xml:space="preserve"> — Correct. re- is a bound prefix meaning "again," build is the free base, -ing is bound.</w:t>
       </w:r>
     </w:p>
     <w:p>
@@ -625,14 +847,14 @@
         <w:rPr>
           <w:sz w:val="22"/>
         </w:rPr>
-        <w:t>b. carpet</w:t>
+        <w:t>b. re- (free) + build (free) + -ing (bound)</w:t>
       </w:r>
       <w:r>
         <w:rPr>
           <w:i/>
           <w:sz w:val="20"/>
         </w:rPr>
-        <w:t xml:space="preserve"> — 1 morpheme. "Car" + "pet" is coincidental resemblance.</w:t>
+        <w:t xml:space="preserve"> — Incorrect. re- is bound, not free.</w:t>
       </w:r>
     </w:p>
     <w:p>
@@ -642,17 +864,110 @@
       </w:pPr>
       <w:r>
         <w:rPr>
+          <w:sz w:val="22"/>
+        </w:rPr>
+        <w:t>c. rebuild (free) + -ing (bound)</w:t>
+      </w:r>
+      <w:r>
+        <w:rPr>
+          <w:i/>
+          <w:sz w:val="20"/>
+        </w:rPr>
+        <w:t xml:space="preserve"> — Incorrect. rebuild can be further divided.</w:t>
+      </w:r>
+    </w:p>
+    <w:p>
+      <w:pPr>
+        <w:spacing w:before="20" w:after="20"/>
+        <w:ind w:left="720"/>
+      </w:pPr>
+      <w:r>
+        <w:rPr>
+          <w:sz w:val="22"/>
+        </w:rPr>
+        <w:t>d. re- (bound) + building (free)</w:t>
+      </w:r>
+      <w:r>
+        <w:rPr>
+          <w:i/>
+          <w:sz w:val="20"/>
+        </w:rPr>
+        <w:t xml:space="preserve"> — Incorrect. building should be divided into build + -ing.</w:t>
+      </w:r>
+    </w:p>
+    <w:p>
+      <w:pPr>
+        <w:spacing w:before="120" w:after="40"/>
+      </w:pPr>
+      <w:r>
+        <w:rPr>
           <w:b/>
           <w:sz w:val="22"/>
         </w:rPr>
-        <w:t>c. bookcase</w:t>
+        <w:t xml:space="preserve">Question 8: </w:t>
+      </w:r>
+      <w:r>
+        <w:rPr>
+          <w:sz w:val="22"/>
+        </w:rPr>
+        <w:t>According to the basic structure of English sentences, every sentence (S) divides into which two parts?</w:t>
+      </w:r>
+      <w:r>
+        <w:rPr>
+          <w:sz w:val="22"/>
+        </w:rPr>
+        <w:t xml:space="preserve"> (2 pts)</w:t>
+      </w:r>
+    </w:p>
+    <w:p>
+      <w:pPr>
+        <w:spacing w:before="40" w:after="40"/>
+        <w:ind w:left="432"/>
+      </w:pPr>
+      <w:r>
+        <w:rPr>
+          <w:b/>
+          <w:sz w:val="22"/>
+        </w:rPr>
+        <w:t xml:space="preserve">Answer: </w:t>
+      </w:r>
+      <w:r>
+        <w:rPr>
+          <w:b/>
+          <w:sz w:val="22"/>
+        </w:rPr>
+        <w:t>c</w:t>
+      </w:r>
+    </w:p>
+    <w:p>
+      <w:pPr>
+        <w:spacing w:before="20" w:after="20"/>
+        <w:ind w:left="720"/>
+      </w:pPr>
+      <w:r>
+        <w:rPr>
+          <w:sz w:val="22"/>
+        </w:rPr>
+        <w:t>a. Determiner + Sentence</w:t>
+      </w:r>
+    </w:p>
+    <w:p>
+      <w:pPr>
+        <w:spacing w:before="20" w:after="20"/>
+        <w:ind w:left="720"/>
+      </w:pPr>
+      <w:r>
+        <w:rPr>
+          <w:sz w:val="22"/>
+        </w:rPr>
+        <w:t>b. Noun + Verb</w:t>
       </w:r>
       <w:r>
         <w:rPr>
           <w:i/>
           <w:sz w:val="20"/>
         </w:rPr>
-        <w:t xml:space="preserve"> — 2 free morphemes: book + case. The meaning is compositional.</w:t>
+        <w:t xml:space="preserve"> — Too narrow; subjects and predicates are phrases, not just single words.</w:t>
       </w:r>
     </w:p>
     <w:p>
@@ -662,20 +977,44 @@
       </w:pPr>
       <w:r>
         <w:rPr>
+          <w:b/>
           <w:sz w:val="22"/>
         </w:rPr>
-        <w:t>d. receive</w:t>
+        <w:t>c. Subject NP + Predicate VP</w:t>
       </w:r>
       <w:r>
         <w:rPr>
           <w:i/>
           <w:sz w:val="20"/>
         </w:rPr>
-        <w:t xml:space="preserve"> — 1 morpheme. "Ceive" is not a word in modern English.</w:t>
+        <w:t xml:space="preserve"> — Correct. S → NP + VP is the fundamental structure of every English sentence.</w:t>
       </w:r>
     </w:p>
     <w:p>
       <w:pPr>
+        <w:spacing w:before="20" w:after="20"/>
+        <w:ind w:left="720"/>
+      </w:pPr>
+      <w:r>
+        <w:rPr>
+          <w:sz w:val="22"/>
+        </w:rPr>
+        <w:t>d. Adjective Phrase + Verb Phrase</w:t>
+      </w:r>
+    </w:p>
+    <w:p>
+      <w:pPr>
+        <w:pStyle w:val="Heading3"/>
+      </w:pPr>
+      <w:r>
+        <w:rPr>
+          <w:sz w:val="24"/>
+        </w:rPr>
+        <w:t>Section A2: Open and Closed Classes (Questions 9–16, 16 points)</w:t>
+      </w:r>
+    </w:p>
+    <w:p>
+      <w:pPr>
         <w:spacing w:before="120" w:after="40"/>
       </w:pPr>
       <w:r>
@@ -683,13 +1022,13 @@
           <w:b/>
           <w:sz w:val="22"/>
         </w:rPr>
-        <w:t xml:space="preserve">Question 6: </w:t>
+        <w:t xml:space="preserve">Question 9: </w:t>
       </w:r>
       <w:r>
         <w:rPr>
           <w:sz w:val="22"/>
         </w:rPr>
-        <w:t>The word "unhelpful" contains how many morphemes?</w:t>
+        <w:t>Which of the following word classes is an open class?</w:t>
       </w:r>
       <w:r>
         <w:rPr>
@@ -727,7 +1066,14 @@
         <w:rPr>
           <w:sz w:val="22"/>
         </w:rPr>
-        <w:t>a. 1</w:t>
+        <w:t>a. Determiners</w:t>
+      </w:r>
+      <w:r>
+        <w:rPr>
+          <w:i/>
+          <w:sz w:val="20"/>
+        </w:rPr>
+        <w:t xml:space="preserve"> — closed class</w:t>
       </w:r>
     </w:p>
     <w:p>
@@ -739,7 +1085,14 @@
         <w:rPr>
           <w:sz w:val="22"/>
         </w:rPr>
-        <w:t>b. 2</w:t>
+        <w:t>b. Pronouns</w:t>
+      </w:r>
+      <w:r>
+        <w:rPr>
+          <w:i/>
+          <w:sz w:val="20"/>
+        </w:rPr>
+        <w:t xml:space="preserve"> — closed class</w:t>
       </w:r>
     </w:p>
     <w:p>
@@ -752,14 +1105,14 @@
           <w:b/>
           <w:sz w:val="22"/>
         </w:rPr>
-        <w:t>c. 3</w:t>
+        <w:t>c. Adjectives</w:t>
       </w:r>
       <w:r>
         <w:rPr>
           <w:i/>
           <w:sz w:val="20"/>
         </w:rPr>
-        <w:t xml:space="preserve"> — un- (bound) + help (free) + -ful (bound)</w:t>
+        <w:t xml:space="preserve"> — open class (readily accepts new members: viral, binge-worthy, gluten-free)</w:t>
       </w:r>
     </w:p>
     <w:p>
@@ -771,7 +1124,14 @@
         <w:rPr>
           <w:sz w:val="22"/>
         </w:rPr>
-        <w:t>d. 4</w:t>
+        <w:t>d. Prepositions</w:t>
+      </w:r>
+      <w:r>
+        <w:rPr>
+          <w:i/>
+          <w:sz w:val="20"/>
+        </w:rPr>
+        <w:t xml:space="preserve"> — closed class</w:t>
       </w:r>
     </w:p>
     <w:p>
@@ -783,13 +1143,13 @@
           <w:b/>
           <w:sz w:val="22"/>
         </w:rPr>
-        <w:t xml:space="preserve">Question 7: </w:t>
+        <w:t xml:space="preserve">Question 10: </w:t>
       </w:r>
       <w:r>
         <w:rPr>
           <w:sz w:val="22"/>
         </w:rPr>
-        <w:t>Which of the following correctly identifies the morphemes in "rebuilding"?</w:t>
+        <w:t>Which feature best distinguishes determiners from adjectives?</w:t>
       </w:r>
       <w:r>
         <w:rPr>
@@ -815,7 +1175,7 @@
           <w:b/>
           <w:sz w:val="22"/>
         </w:rPr>
-        <w:t>a</w:t>
+        <w:t>c</w:t>
       </w:r>
     </w:p>
     <w:p>
@@ -825,17 +1185,55 @@
       </w:pPr>
       <w:r>
         <w:rPr>
+          <w:sz w:val="22"/>
+        </w:rPr>
+        <w:t>a. Determiners appear after the noun</w:t>
+      </w:r>
+      <w:r>
+        <w:rPr>
+          <w:i/>
+          <w:sz w:val="20"/>
+        </w:rPr>
+        <w:t xml:space="preserve"> — Incorrect. Determiners appear before the noun.</w:t>
+      </w:r>
+    </w:p>
+    <w:p>
+      <w:pPr>
+        <w:spacing w:before="20" w:after="20"/>
+        <w:ind w:left="720"/>
+      </w:pPr>
+      <w:r>
+        <w:rPr>
+          <w:sz w:val="22"/>
+        </w:rPr>
+        <w:t>b. Determiners can be modified by "very"</w:t>
+      </w:r>
+      <w:r>
+        <w:rPr>
+          <w:i/>
+          <w:sz w:val="20"/>
+        </w:rPr>
+        <w:t xml:space="preserve"> — Incorrect. Adjectives can be modified by "very"; determiners cannot.</w:t>
+      </w:r>
+    </w:p>
+    <w:p>
+      <w:pPr>
+        <w:spacing w:before="20" w:after="20"/>
+        <w:ind w:left="720"/>
+      </w:pPr>
+      <w:r>
+        <w:rPr>
           <w:b/>
           <w:sz w:val="22"/>
         </w:rPr>
-        <w:t>a. re- (bound) + build (free) + -ing (bound)</w:t>
+        <w:t>c. Determiners must appear before any adjectives in a noun phrase</w:t>
       </w:r>
       <w:r>
         <w:rPr>
           <w:i/>
           <w:sz w:val="20"/>
         </w:rPr>
-        <w:t xml:space="preserve"> — Correct. re- is a bound prefix meaning "again," build is the free base, -ing is bound.</w:t>
+        <w:t xml:space="preserve"> — Correct. DET + ADJ + N (the tall man, not tall the man).</w:t>
       </w:r>
     </w:p>
     <w:p>
@@ -847,18 +1245,62 @@
         <w:rPr>
           <w:sz w:val="22"/>
         </w:rPr>
-        <w:t>b. re- (free) + build (free) + -ing (bound)</w:t>
+        <w:t>d. Determiners describe qualities of the noun</w:t>
       </w:r>
       <w:r>
         <w:rPr>
           <w:i/>
           <w:sz w:val="20"/>
         </w:rPr>
-        <w:t xml:space="preserve"> — Incorrect. re- is bound, not free.</w:t>
+        <w:t xml:space="preserve"> — Incorrect. Adjectives describe qualities; determiners specify reference.</w:t>
       </w:r>
     </w:p>
     <w:p>
       <w:pPr>
+        <w:spacing w:before="120" w:after="40"/>
+      </w:pPr>
+      <w:r>
+        <w:rPr>
+          <w:b/>
+          <w:sz w:val="22"/>
+        </w:rPr>
+        <w:t xml:space="preserve">Question 11: </w:t>
+      </w:r>
+      <w:r>
+        <w:rPr>
+          <w:sz w:val="22"/>
+        </w:rPr>
+        <w:t>In the phrase "the tall student from Ohio," which word is the head of the noun phrase?</w:t>
+      </w:r>
+      <w:r>
+        <w:rPr>
+          <w:sz w:val="22"/>
+        </w:rPr>
+        <w:t xml:space="preserve"> (2 pts)</w:t>
+      </w:r>
+    </w:p>
+    <w:p>
+      <w:pPr>
+        <w:spacing w:before="40" w:after="40"/>
+        <w:ind w:left="432"/>
+      </w:pPr>
+      <w:r>
+        <w:rPr>
+          <w:b/>
+          <w:sz w:val="22"/>
+        </w:rPr>
+        <w:t xml:space="preserve">Answer: </w:t>
+      </w:r>
+      <w:r>
+        <w:rPr>
+          <w:b/>
+          <w:sz w:val="22"/>
+        </w:rPr>
+        <w:t>c</w:t>
+      </w:r>
+    </w:p>
+    <w:p>
+      <w:pPr>
         <w:spacing w:before="20" w:after="20"/>
         <w:ind w:left="720"/>
       </w:pPr>
@@ -866,14 +1308,14 @@
         <w:rPr>
           <w:sz w:val="22"/>
         </w:rPr>
-        <w:t>c. rebuild (free) + -ing (bound)</w:t>
+        <w:t>a. the</w:t>
       </w:r>
       <w:r>
         <w:rPr>
           <w:i/>
           <w:sz w:val="20"/>
         </w:rPr>
-        <w:t xml:space="preserve"> — Incorrect. rebuild can be further divided.</w:t>
+        <w:t xml:space="preserve"> — determiner (modifier)</w:t>
       </w:r>
     </w:p>
     <w:p>
@@ -885,42 +1327,81 @@
         <w:rPr>
           <w:sz w:val="22"/>
         </w:rPr>
-        <w:t>d. re- (bound) + building (free)</w:t>
+        <w:t>b. tall</w:t>
       </w:r>
       <w:r>
         <w:rPr>
           <w:i/>
           <w:sz w:val="20"/>
         </w:rPr>
-        <w:t xml:space="preserve"> — Incorrect. building should be divided into build + -ing.</w:t>
+        <w:t xml:space="preserve"> — adjective (modifier)</w:t>
       </w:r>
     </w:p>
     <w:p>
       <w:pPr>
-        <w:spacing w:before="120" w:after="40"/>
+        <w:spacing w:before="20" w:after="20"/>
+        <w:ind w:left="720"/>
       </w:pPr>
       <w:r>
         <w:rPr>
           <w:b/>
           <w:sz w:val="22"/>
         </w:rPr>
-        <w:t xml:space="preserve">Question 8: </w:t>
-      </w:r>
-      <w:r>
-        <w:rPr>
-          <w:sz w:val="22"/>
-        </w:rPr>
-        <w:t>Which word best demonstrates morphological productivity — the active use of existing morpheme patterns to create new words?</w:t>
-      </w:r>
-      <w:r>
-        <w:rPr>
-          <w:sz w:val="22"/>
-        </w:rPr>
-        <w:t xml:space="preserve"> (2 pts)</w:t>
+        <w:t>c. student</w:t>
+      </w:r>
+      <w:r>
+        <w:rPr>
+          <w:i/>
+          <w:sz w:val="20"/>
+        </w:rPr>
+        <w:t xml:space="preserve"> — The head noun. Cannot be removed without destroying the phrase.</w:t>
       </w:r>
     </w:p>
     <w:p>
       <w:pPr>
+        <w:spacing w:before="20" w:after="20"/>
+        <w:ind w:left="720"/>
+      </w:pPr>
+      <w:r>
+        <w:rPr>
+          <w:sz w:val="22"/>
+        </w:rPr>
+        <w:t>d. Ohio</w:t>
+      </w:r>
+      <w:r>
+        <w:rPr>
+          <w:i/>
+          <w:sz w:val="20"/>
+        </w:rPr>
+        <w:t xml:space="preserve"> — head of a nested NP inside the PP, not the head of the main NP.</w:t>
+      </w:r>
+    </w:p>
+    <w:p>
+      <w:pPr>
+        <w:spacing w:before="120" w:after="40"/>
+      </w:pPr>
+      <w:r>
+        <w:rPr>
+          <w:b/>
+          <w:sz w:val="22"/>
+        </w:rPr>
+        <w:t xml:space="preserve">Question 12: </w:t>
+      </w:r>
+      <w:r>
+        <w:rPr>
+          <w:sz w:val="22"/>
+        </w:rPr>
+        <w:t>Which of the following words is a determiner?</w:t>
+      </w:r>
+      <w:r>
+        <w:rPr>
+          <w:sz w:val="22"/>
+        </w:rPr>
+        <w:t xml:space="preserve"> (2 pts)</w:t>
+      </w:r>
+    </w:p>
+    <w:p>
+      <w:pPr>
         <w:spacing w:before="40" w:after="40"/>
         <w:ind w:left="432"/>
       </w:pPr>
@@ -936,7 +1417,7 @@
           <w:b/>
           <w:sz w:val="22"/>
         </w:rPr>
-        <w:t>b</w:t>
+        <w:t>c</w:t>
       </w:r>
     </w:p>
     <w:p>
@@ -948,14 +1429,14 @@
         <w:rPr>
           <w:sz w:val="22"/>
         </w:rPr>
-        <w:t>a. receive</w:t>
+        <w:t>a. beautiful</w:t>
       </w:r>
       <w:r>
         <w:rPr>
           <w:i/>
           <w:sz w:val="20"/>
         </w:rPr>
-        <w:t xml:space="preserve"> — Borrowed as a whole word from Latin.</w:t>
+        <w:t xml:space="preserve"> — adjective</w:t>
       </w:r>
     </w:p>
     <w:p>
@@ -965,17 +1446,36 @@
       </w:pPr>
       <w:r>
         <w:rPr>
+          <w:sz w:val="22"/>
+        </w:rPr>
+        <w:t>b. quickly</w:t>
+      </w:r>
+      <w:r>
+        <w:rPr>
+          <w:i/>
+          <w:sz w:val="20"/>
+        </w:rPr>
+        <w:t xml:space="preserve"> — adverb</w:t>
+      </w:r>
+    </w:p>
+    <w:p>
+      <w:pPr>
+        <w:spacing w:before="20" w:after="20"/>
+        <w:ind w:left="720"/>
+      </w:pPr>
+      <w:r>
+        <w:rPr>
           <w:b/>
           <w:sz w:val="22"/>
         </w:rPr>
-        <w:t>b. podcaster</w:t>
+        <w:t>c. every</w:t>
       </w:r>
       <w:r>
         <w:rPr>
           <w:i/>
           <w:sz w:val="20"/>
         </w:rPr>
-        <w:t xml:space="preserve"> — A recent creation using the productive -er suffix added to podcast.</w:t>
+        <w:t xml:space="preserve"> — determiner (appears before adjectives; cannot be modified by "very")</w:t>
       </w:r>
     </w:p>
     <w:p>
@@ -987,18 +1487,62 @@
         <w:rPr>
           <w:sz w:val="22"/>
         </w:rPr>
-        <w:t>c. understand</w:t>
+        <w:t>d. student</w:t>
       </w:r>
       <w:r>
         <w:rPr>
           <w:i/>
           <w:sz w:val="20"/>
         </w:rPr>
-        <w:t xml:space="preserve"> — A single morpheme; no productive process visible.</w:t>
+        <w:t xml:space="preserve"> — noun</w:t>
       </w:r>
     </w:p>
     <w:p>
       <w:pPr>
+        <w:spacing w:before="120" w:after="40"/>
+      </w:pPr>
+      <w:r>
+        <w:rPr>
+          <w:b/>
+          <w:sz w:val="22"/>
+        </w:rPr>
+        <w:t xml:space="preserve">Question 13: </w:t>
+      </w:r>
+      <w:r>
+        <w:rPr>
+          <w:sz w:val="22"/>
+        </w:rPr>
+        <w:t>"The professor entered the room and placed her notes on the desk." What is the antecedent of "her"?</w:t>
+      </w:r>
+      <w:r>
+        <w:rPr>
+          <w:sz w:val="22"/>
+        </w:rPr>
+        <w:t xml:space="preserve"> (2 pts)</w:t>
+      </w:r>
+    </w:p>
+    <w:p>
+      <w:pPr>
+        <w:spacing w:before="40" w:after="40"/>
+        <w:ind w:left="432"/>
+      </w:pPr>
+      <w:r>
+        <w:rPr>
+          <w:b/>
+          <w:sz w:val="22"/>
+        </w:rPr>
+        <w:t xml:space="preserve">Answer: </w:t>
+      </w:r>
+      <w:r>
+        <w:rPr>
+          <w:b/>
+          <w:sz w:val="22"/>
+        </w:rPr>
+        <w:t>b</w:t>
+      </w:r>
+    </w:p>
+    <w:p>
+      <w:pPr>
         <w:spacing w:before="20" w:after="20"/>
         <w:ind w:left="720"/>
       </w:pPr>
@@ -1006,29 +1550,55 @@
         <w:rPr>
           <w:sz w:val="22"/>
         </w:rPr>
-        <w:t>d. carpet</w:t>
+        <w:t>a. The room</w:t>
+      </w:r>
+    </w:p>
+    <w:p>
+      <w:pPr>
+        <w:spacing w:before="20" w:after="20"/>
+        <w:ind w:left="720"/>
+      </w:pPr>
+      <w:r>
+        <w:rPr>
+          <w:b/>
+          <w:sz w:val="22"/>
+        </w:rPr>
+        <w:t>b. The professor</w:t>
       </w:r>
       <w:r>
         <w:rPr>
           <w:i/>
           <w:sz w:val="20"/>
         </w:rPr>
-        <w:t xml:space="preserve"> — A single morpheme; no productive process visible.</w:t>
+        <w:t xml:space="preserve"> — "her" (third person, singular, feminine) refers back to "The professor."</w:t>
       </w:r>
     </w:p>
     <w:p>
       <w:pPr>
-        <w:pStyle w:val="Heading3"/>
-      </w:pPr>
-      <w:r>
-        <w:rPr>
-          <w:sz w:val="24"/>
-        </w:rPr>
-        <w:t>Section A2: Open and Closed Classes (Questions 9–16, 16 points)</w:t>
+        <w:spacing w:before="20" w:after="20"/>
+        <w:ind w:left="720"/>
+      </w:pPr>
+      <w:r>
+        <w:rPr>
+          <w:sz w:val="22"/>
+        </w:rPr>
+        <w:t>c. The desk</w:t>
       </w:r>
     </w:p>
     <w:p>
       <w:pPr>
+        <w:spacing w:before="20" w:after="20"/>
+        <w:ind w:left="720"/>
+      </w:pPr>
+      <w:r>
+        <w:rPr>
+          <w:sz w:val="22"/>
+        </w:rPr>
+        <w:t>d. her notes</w:t>
+      </w:r>
+    </w:p>
+    <w:p>
+      <w:pPr>
         <w:spacing w:before="120" w:after="40"/>
       </w:pPr>
       <w:r>
@@ -1036,13 +1606,13 @@
           <w:b/>
           <w:sz w:val="22"/>
         </w:rPr>
-        <w:t xml:space="preserve">Question 9: </w:t>
+        <w:t xml:space="preserve">Question 14: </w:t>
       </w:r>
       <w:r>
         <w:rPr>
           <w:sz w:val="22"/>
         </w:rPr>
-        <w:t>Which of the following word classes is an open class?</w:t>
+        <w:t>Pronouns replace which of the following elements?</w:t>
       </w:r>
       <w:r>
         <w:rPr>
@@ -1068,7 +1638,7 @@
           <w:b/>
           <w:sz w:val="22"/>
         </w:rPr>
-        <w:t>c</w:t>
+        <w:t>b</w:t>
       </w:r>
     </w:p>
     <w:p>
@@ -1080,14 +1650,27 @@
         <w:rPr>
           <w:sz w:val="22"/>
         </w:rPr>
-        <w:t>a. Determiners</w:t>
+        <w:t>a. Only the head noun</w:t>
+      </w:r>
+    </w:p>
+    <w:p>
+      <w:pPr>
+        <w:spacing w:before="20" w:after="20"/>
+        <w:ind w:left="720"/>
+      </w:pPr>
+      <w:r>
+        <w:rPr>
+          <w:b/>
+          <w:sz w:val="22"/>
+        </w:rPr>
+        <w:t>b. The entire noun phrase</w:t>
       </w:r>
       <w:r>
         <w:rPr>
           <w:i/>
           <w:sz w:val="20"/>
         </w:rPr>
-        <w:t xml:space="preserve"> — closed class</w:t>
+        <w:t xml:space="preserve"> — Correct. Pronouns replace the full NP including all modifiers: "the tall student from Ohio" → "she."</w:t>
       </w:r>
     </w:p>
     <w:p>
@@ -1099,14 +1682,82 @@
         <w:rPr>
           <w:sz w:val="22"/>
         </w:rPr>
-        <w:t>b. Pronouns</w:t>
+        <w:t>c. Only the determiner and noun</w:t>
+      </w:r>
+    </w:p>
+    <w:p>
+      <w:pPr>
+        <w:spacing w:before="20" w:after="20"/>
+        <w:ind w:left="720"/>
+      </w:pPr>
+      <w:r>
+        <w:rPr>
+          <w:sz w:val="22"/>
+        </w:rPr>
+        <w:t>d. The verb phrase</w:t>
+      </w:r>
+    </w:p>
+    <w:p>
+      <w:pPr>
+        <w:spacing w:before="120" w:after="40"/>
+      </w:pPr>
+      <w:r>
+        <w:rPr>
+          <w:b/>
+          <w:sz w:val="22"/>
+        </w:rPr>
+        <w:t xml:space="preserve">Question 15: </w:t>
+      </w:r>
+      <w:r>
+        <w:rPr>
+          <w:sz w:val="22"/>
+        </w:rPr>
+        <w:t>Which of the following words is a preposition?</w:t>
+      </w:r>
+      <w:r>
+        <w:rPr>
+          <w:sz w:val="22"/>
+        </w:rPr>
+        <w:t xml:space="preserve"> (2 pts)</w:t>
+      </w:r>
+    </w:p>
+    <w:p>
+      <w:pPr>
+        <w:spacing w:before="40" w:after="40"/>
+        <w:ind w:left="432"/>
+      </w:pPr>
+      <w:r>
+        <w:rPr>
+          <w:b/>
+          <w:sz w:val="22"/>
+        </w:rPr>
+        <w:t xml:space="preserve">Answer: </w:t>
+      </w:r>
+      <w:r>
+        <w:rPr>
+          <w:b/>
+          <w:sz w:val="22"/>
+        </w:rPr>
+        <w:t>c</w:t>
+      </w:r>
+    </w:p>
+    <w:p>
+      <w:pPr>
+        <w:spacing w:before="20" w:after="20"/>
+        <w:ind w:left="720"/>
+      </w:pPr>
+      <w:r>
+        <w:rPr>
+          <w:sz w:val="22"/>
+        </w:rPr>
+        <w:t>a. quickly</w:t>
       </w:r>
       <w:r>
         <w:rPr>
           <w:i/>
           <w:sz w:val="20"/>
         </w:rPr>
-        <w:t xml:space="preserve"> — closed class</w:t>
+        <w:t xml:space="preserve"> — adverb</w:t>
       </w:r>
     </w:p>
     <w:p>
@@ -1116,17 +1767,36 @@
       </w:pPr>
       <w:r>
         <w:rPr>
+          <w:sz w:val="22"/>
+        </w:rPr>
+        <w:t>b. beautiful</w:t>
+      </w:r>
+      <w:r>
+        <w:rPr>
+          <w:i/>
+          <w:sz w:val="20"/>
+        </w:rPr>
+        <w:t xml:space="preserve"> — adjective</w:t>
+      </w:r>
+    </w:p>
+    <w:p>
+      <w:pPr>
+        <w:spacing w:before="20" w:after="20"/>
+        <w:ind w:left="720"/>
+      </w:pPr>
+      <w:r>
+        <w:rPr>
           <w:b/>
           <w:sz w:val="22"/>
         </w:rPr>
-        <w:t>c. Adjectives</w:t>
+        <w:t>c. through</w:t>
       </w:r>
       <w:r>
         <w:rPr>
           <w:i/>
           <w:sz w:val="20"/>
         </w:rPr>
-        <w:t xml:space="preserve"> — open class (readily accepts new members: viral, binge-worthy, gluten-free)</w:t>
+        <w:t xml:space="preserve"> — preposition</w:t>
       </w:r>
     </w:p>
     <w:p>
@@ -1138,14 +1808,14 @@
         <w:rPr>
           <w:sz w:val="22"/>
         </w:rPr>
-        <w:t>d. Prepositions</w:t>
+        <w:t>d. they</w:t>
       </w:r>
       <w:r>
         <w:rPr>
           <w:i/>
           <w:sz w:val="20"/>
         </w:rPr>
-        <w:t xml:space="preserve"> — closed class</w:t>
+        <w:t xml:space="preserve"> — pronoun</w:t>
       </w:r>
     </w:p>
     <w:p>
@@ -1157,13 +1827,13 @@
           <w:b/>
           <w:sz w:val="22"/>
         </w:rPr>
-        <w:t xml:space="preserve">Question 10: </w:t>
+        <w:t xml:space="preserve">Question 16: </w:t>
       </w:r>
       <w:r>
         <w:rPr>
           <w:sz w:val="22"/>
         </w:rPr>
-        <w:t>Which feature best distinguishes determiners from adjectives?</w:t>
+        <w:t>Which of the following is NOT a determiner?</w:t>
       </w:r>
       <w:r>
         <w:rPr>
@@ -1201,14 +1871,14 @@
         <w:rPr>
           <w:sz w:val="22"/>
         </w:rPr>
-        <w:t>a. Determiners appear after the noun</w:t>
+        <w:t>a. the</w:t>
       </w:r>
       <w:r>
         <w:rPr>
           <w:i/>
           <w:sz w:val="20"/>
         </w:rPr>
-        <w:t xml:space="preserve"> — Incorrect. Determiners appear before the noun.</w:t>
+        <w:t xml:space="preserve"> — determiner</w:t>
       </w:r>
     </w:p>
     <w:p>
@@ -1220,14 +1890,14 @@
         <w:rPr>
           <w:sz w:val="22"/>
         </w:rPr>
-        <w:t>b. Determiners can be modified by "very"</w:t>
+        <w:t>b. every</w:t>
       </w:r>
       <w:r>
         <w:rPr>
           <w:i/>
           <w:sz w:val="20"/>
         </w:rPr>
-        <w:t xml:space="preserve"> — Incorrect. Adjectives can be modified by "very"; determiners cannot.</w:t>
+        <w:t xml:space="preserve"> — determiner</w:t>
       </w:r>
     </w:p>
     <w:p>
@@ -1240,14 +1910,14 @@
           <w:b/>
           <w:sz w:val="22"/>
         </w:rPr>
-        <w:t>c. Determiners must appear before any adjectives in a noun phrase</w:t>
+        <w:t>c. very</w:t>
       </w:r>
       <w:r>
         <w:rPr>
           <w:i/>
           <w:sz w:val="20"/>
         </w:rPr>
-        <w:t xml:space="preserve"> — Correct. DET + ADJ + N (the tall man, not tall the man).</w:t>
+        <w:t xml:space="preserve"> — adverb (modifies adjectives and adverbs, not nouns)</w:t>
       </w:r>
     </w:p>
     <w:p>
@@ -1259,18 +1929,41 @@
         <w:rPr>
           <w:sz w:val="22"/>
         </w:rPr>
-        <w:t>d. Determiners describe qualities of the noun</w:t>
+        <w:t>d. some</w:t>
       </w:r>
       <w:r>
         <w:rPr>
           <w:i/>
           <w:sz w:val="20"/>
         </w:rPr>
-        <w:t xml:space="preserve"> — Incorrect. Adjectives describe qualities; determiners specify reference.</w:t>
+        <w:t xml:space="preserve"> — determiner</w:t>
       </w:r>
     </w:p>
     <w:p>
       <w:pPr>
+        <w:pStyle w:val="Heading3"/>
+      </w:pPr>
+      <w:r>
+        <w:rPr>
+          <w:sz w:val="24"/>
+        </w:rPr>
+        <w:t>Section A3: Parts of Speech in Context (Questions 17–25, 18 points)</w:t>
+      </w:r>
+    </w:p>
+    <w:p>
+      <w:pPr>
+        <w:spacing w:before="80" w:after="80"/>
+      </w:pPr>
+      <w:r>
+        <w:rPr>
+          <w:i/>
+          <w:sz w:val="22"/>
+        </w:rPr>
+        <w:t>Sentence for Questions 17–18: "Several enthusiastic students quietly studied the challenging material."</w:t>
+      </w:r>
+    </w:p>
+    <w:p>
+      <w:pPr>
         <w:spacing w:before="120" w:after="40"/>
       </w:pPr>
       <w:r>
@@ -1278,13 +1971,13 @@
           <w:b/>
           <w:sz w:val="22"/>
         </w:rPr>
-        <w:t xml:space="preserve">Question 11: </w:t>
+        <w:t xml:space="preserve">Question 17: </w:t>
       </w:r>
       <w:r>
         <w:rPr>
           <w:sz w:val="22"/>
         </w:rPr>
-        <w:t>In the phrase "the tall student from Ohio," which word is the head of the noun phrase?</w:t>
+        <w:t>Which word in the sentence above is a determiner?</w:t>
       </w:r>
       <w:r>
         <w:rPr>
@@ -1310,7 +2003,7 @@
           <w:b/>
           <w:sz w:val="22"/>
         </w:rPr>
-        <w:t>c</w:t>
+        <w:t>b</w:t>
       </w:r>
     </w:p>
     <w:p>
@@ -1322,14 +2015,14 @@
         <w:rPr>
           <w:sz w:val="22"/>
         </w:rPr>
-        <w:t>a. the</w:t>
+        <w:t>a. enthusiastic</w:t>
       </w:r>
       <w:r>
         <w:rPr>
           <w:i/>
           <w:sz w:val="20"/>
         </w:rPr>
-        <w:t xml:space="preserve"> — determiner (modifier)</w:t>
+        <w:t xml:space="preserve"> — adjective</w:t>
       </w:r>
     </w:p>
     <w:p>
@@ -1339,16 +2032,17 @@
       </w:pPr>
       <w:r>
         <w:rPr>
+          <w:b/>
           <w:sz w:val="22"/>
         </w:rPr>
-        <w:t>b. tall</w:t>
+        <w:t>b. Several</w:t>
       </w:r>
       <w:r>
         <w:rPr>
           <w:i/>
           <w:sz w:val="20"/>
         </w:rPr>
-        <w:t xml:space="preserve"> — adjective (modifier)</w:t>
+        <w:t xml:space="preserve"> — determiner (indicates amount; cannot be modified by "very"; appears before adjectives)</w:t>
       </w:r>
     </w:p>
     <w:p>
@@ -1358,17 +2052,98 @@
       </w:pPr>
       <w:r>
         <w:rPr>
+          <w:sz w:val="22"/>
+        </w:rPr>
+        <w:t>c. quietly</w:t>
+      </w:r>
+      <w:r>
+        <w:rPr>
+          <w:i/>
+          <w:sz w:val="20"/>
+        </w:rPr>
+        <w:t xml:space="preserve"> — adverb</w:t>
+      </w:r>
+    </w:p>
+    <w:p>
+      <w:pPr>
+        <w:spacing w:before="20" w:after="20"/>
+        <w:ind w:left="720"/>
+      </w:pPr>
+      <w:r>
+        <w:rPr>
+          <w:sz w:val="22"/>
+        </w:rPr>
+        <w:t>d. challenging</w:t>
+      </w:r>
+      <w:r>
+        <w:rPr>
+          <w:i/>
+          <w:sz w:val="20"/>
+        </w:rPr>
+        <w:t xml:space="preserve"> — adjective</w:t>
+      </w:r>
+    </w:p>
+    <w:p>
+      <w:pPr>
+        <w:spacing w:before="120" w:after="40"/>
+      </w:pPr>
+      <w:r>
+        <w:rPr>
           <w:b/>
           <w:sz w:val="22"/>
         </w:rPr>
-        <w:t>c. student</w:t>
+        <w:t xml:space="preserve">Question 18: </w:t>
+      </w:r>
+      <w:r>
+        <w:rPr>
+          <w:sz w:val="22"/>
+        </w:rPr>
+        <w:t>In the sentence “Several enthusiastic students quietly studied the challenging material,” which word is an adverb?</w:t>
+      </w:r>
+      <w:r>
+        <w:rPr>
+          <w:sz w:val="22"/>
+        </w:rPr>
+        <w:t xml:space="preserve"> (2 pts)</w:t>
+      </w:r>
+    </w:p>
+    <w:p>
+      <w:pPr>
+        <w:spacing w:before="40" w:after="40"/>
+        <w:ind w:left="432"/>
+      </w:pPr>
+      <w:r>
+        <w:rPr>
+          <w:b/>
+          <w:sz w:val="22"/>
+        </w:rPr>
+        <w:t xml:space="preserve">Answer: </w:t>
+      </w:r>
+      <w:r>
+        <w:rPr>
+          <w:b/>
+          <w:sz w:val="22"/>
+        </w:rPr>
+        <w:t>c</w:t>
+      </w:r>
+    </w:p>
+    <w:p>
+      <w:pPr>
+        <w:spacing w:before="20" w:after="20"/>
+        <w:ind w:left="720"/>
+      </w:pPr>
+      <w:r>
+        <w:rPr>
+          <w:sz w:val="22"/>
+        </w:rPr>
+        <w:t>a. Several</w:t>
       </w:r>
       <w:r>
         <w:rPr>
           <w:i/>
           <w:sz w:val="20"/>
         </w:rPr>
-        <w:t xml:space="preserve"> — The head noun. Cannot be removed without destroying the phrase.</w:t>
+        <w:t xml:space="preserve"> — determiner</w:t>
       </w:r>
     </w:p>
     <w:p>
@@ -1380,42 +2155,81 @@
         <w:rPr>
           <w:sz w:val="22"/>
         </w:rPr>
-        <w:t>d. Ohio</w:t>
+        <w:t>b. enthusiastic</w:t>
       </w:r>
       <w:r>
         <w:rPr>
           <w:i/>
           <w:sz w:val="20"/>
         </w:rPr>
-        <w:t xml:space="preserve"> — head of a nested NP inside the PP, not the head of the main NP.</w:t>
+        <w:t xml:space="preserve"> — adjective</w:t>
       </w:r>
     </w:p>
     <w:p>
       <w:pPr>
-        <w:spacing w:before="120" w:after="40"/>
+        <w:spacing w:before="20" w:after="20"/>
+        <w:ind w:left="720"/>
       </w:pPr>
       <w:r>
         <w:rPr>
           <w:b/>
           <w:sz w:val="22"/>
         </w:rPr>
-        <w:t xml:space="preserve">Question 12: </w:t>
-      </w:r>
-      <w:r>
-        <w:rPr>
-          <w:sz w:val="22"/>
-        </w:rPr>
-        <w:t>Which of the following words is a determiner?</w:t>
-      </w:r>
-      <w:r>
-        <w:rPr>
-          <w:sz w:val="22"/>
-        </w:rPr>
-        <w:t xml:space="preserve"> (2 pts)</w:t>
+        <w:t>c. quietly</w:t>
+      </w:r>
+      <w:r>
+        <w:rPr>
+          <w:i/>
+          <w:sz w:val="20"/>
+        </w:rPr>
+        <w:t xml:space="preserve"> — adverb (modifies the verb "studied"; formed with -ly from quiet)</w:t>
       </w:r>
     </w:p>
     <w:p>
       <w:pPr>
+        <w:spacing w:before="20" w:after="20"/>
+        <w:ind w:left="720"/>
+      </w:pPr>
+      <w:r>
+        <w:rPr>
+          <w:sz w:val="22"/>
+        </w:rPr>
+        <w:t>d. material</w:t>
+      </w:r>
+      <w:r>
+        <w:rPr>
+          <w:i/>
+          <w:sz w:val="20"/>
+        </w:rPr>
+        <w:t xml:space="preserve"> — noun</w:t>
+      </w:r>
+    </w:p>
+    <w:p>
+      <w:pPr>
+        <w:spacing w:before="120" w:after="40"/>
+      </w:pPr>
+      <w:r>
+        <w:rPr>
+          <w:b/>
+          <w:sz w:val="22"/>
+        </w:rPr>
+        <w:t xml:space="preserve">Question 19: </w:t>
+      </w:r>
+      <w:r>
+        <w:rPr>
+          <w:sz w:val="22"/>
+        </w:rPr>
+        <w:t>"The professor with the briefcase lectured brilliantly." What part of speech is "with"?</w:t>
+      </w:r>
+      <w:r>
+        <w:rPr>
+          <w:sz w:val="22"/>
+        </w:rPr>
+        <w:t xml:space="preserve"> (2 pts)</w:t>
+      </w:r>
+    </w:p>
+    <w:p>
+      <w:pPr>
         <w:spacing w:before="40" w:after="40"/>
         <w:ind w:left="432"/>
       </w:pPr>
@@ -1443,14 +2257,39 @@
         <w:rPr>
           <w:sz w:val="22"/>
         </w:rPr>
-        <w:t>a. beautiful</w:t>
+        <w:t>a. Conjunction</w:t>
+      </w:r>
+    </w:p>
+    <w:p>
+      <w:pPr>
+        <w:spacing w:before="20" w:after="20"/>
+        <w:ind w:left="720"/>
+      </w:pPr>
+      <w:r>
+        <w:rPr>
+          <w:sz w:val="22"/>
+        </w:rPr>
+        <w:t>b. Determiner</w:t>
+      </w:r>
+    </w:p>
+    <w:p>
+      <w:pPr>
+        <w:spacing w:before="20" w:after="20"/>
+        <w:ind w:left="720"/>
+      </w:pPr>
+      <w:r>
+        <w:rPr>
+          <w:b/>
+          <w:sz w:val="22"/>
+        </w:rPr>
+        <w:t>c. Preposition</w:t>
       </w:r>
       <w:r>
         <w:rPr>
           <w:i/>
           <w:sz w:val="20"/>
         </w:rPr>
-        <w:t xml:space="preserve"> — adjective</w:t>
+        <w:t xml:space="preserve"> — "With" introduces the prepositional phrase "with the briefcase."</w:t>
       </w:r>
     </w:p>
     <w:p>
@@ -1462,14 +2301,70 @@
         <w:rPr>
           <w:sz w:val="22"/>
         </w:rPr>
-        <w:t>b. quickly</w:t>
+        <w:t>d. Adverb</w:t>
+      </w:r>
+    </w:p>
+    <w:p>
+      <w:pPr>
+        <w:spacing w:before="120" w:after="40"/>
+      </w:pPr>
+      <w:r>
+        <w:rPr>
+          <w:b/>
+          <w:sz w:val="22"/>
+        </w:rPr>
+        <w:t xml:space="preserve">Question 20: </w:t>
+      </w:r>
+      <w:r>
+        <w:rPr>
+          <w:sz w:val="22"/>
+        </w:rPr>
+        <w:t>"My sister carefully examined their proposal." Which word is functioning as a verb?</w:t>
+      </w:r>
+      <w:r>
+        <w:rPr>
+          <w:sz w:val="22"/>
+        </w:rPr>
+        <w:t xml:space="preserve"> (2 pts)</w:t>
+      </w:r>
+    </w:p>
+    <w:p>
+      <w:pPr>
+        <w:spacing w:before="40" w:after="40"/>
+        <w:ind w:left="432"/>
+      </w:pPr>
+      <w:r>
+        <w:rPr>
+          <w:b/>
+          <w:sz w:val="22"/>
+        </w:rPr>
+        <w:t xml:space="preserve">Answer: </w:t>
+      </w:r>
+      <w:r>
+        <w:rPr>
+          <w:b/>
+          <w:sz w:val="22"/>
+        </w:rPr>
+        <w:t>d</w:t>
+      </w:r>
+    </w:p>
+    <w:p>
+      <w:pPr>
+        <w:spacing w:before="20" w:after="20"/>
+        <w:ind w:left="720"/>
+      </w:pPr>
+      <w:r>
+        <w:rPr>
+          <w:sz w:val="22"/>
+        </w:rPr>
+        <w:t>a. My</w:t>
       </w:r>
       <w:r>
         <w:rPr>
           <w:i/>
           <w:sz w:val="20"/>
         </w:rPr>
-        <w:t xml:space="preserve"> — adverb</w:t>
+        <w:t xml:space="preserve"> — determiner</w:t>
       </w:r>
     </w:p>
     <w:p>
@@ -1479,21 +2374,103 @@
       </w:pPr>
       <w:r>
         <w:rPr>
+          <w:sz w:val="22"/>
+        </w:rPr>
+        <w:t>b. sister</w:t>
+      </w:r>
+      <w:r>
+        <w:rPr>
+          <w:i/>
+          <w:sz w:val="20"/>
+        </w:rPr>
+        <w:t xml:space="preserve"> — noun</w:t>
+      </w:r>
+    </w:p>
+    <w:p>
+      <w:pPr>
+        <w:spacing w:before="20" w:after="20"/>
+        <w:ind w:left="720"/>
+      </w:pPr>
+      <w:r>
+        <w:rPr>
+          <w:sz w:val="22"/>
+        </w:rPr>
+        <w:t>c. carefully</w:t>
+      </w:r>
+      <w:r>
+        <w:rPr>
+          <w:i/>
+          <w:sz w:val="20"/>
+        </w:rPr>
+        <w:t xml:space="preserve"> — adverb</w:t>
+      </w:r>
+    </w:p>
+    <w:p>
+      <w:pPr>
+        <w:spacing w:before="20" w:after="20"/>
+        <w:ind w:left="720"/>
+      </w:pPr>
+      <w:r>
+        <w:rPr>
           <w:b/>
           <w:sz w:val="22"/>
         </w:rPr>
-        <w:t>c. every</w:t>
+        <w:t>d. examined</w:t>
       </w:r>
       <w:r>
         <w:rPr>
           <w:i/>
           <w:sz w:val="20"/>
         </w:rPr>
-        <w:t xml:space="preserve"> — determiner (appears before adjectives; cannot be modified by "very")</w:t>
+        <w:t xml:space="preserve"> — verb (the main action; takes past tense -ed)</w:t>
       </w:r>
     </w:p>
     <w:p>
       <w:pPr>
+        <w:spacing w:before="120" w:after="40"/>
+      </w:pPr>
+      <w:r>
+        <w:rPr>
+          <w:b/>
+          <w:sz w:val="22"/>
+        </w:rPr>
+        <w:t xml:space="preserve">Question 21: </w:t>
+      </w:r>
+      <w:r>
+        <w:rPr>
+          <w:sz w:val="22"/>
+        </w:rPr>
+        <w:t>"Three playful kittens explored the mysterious basement." Which word is an adjective?</w:t>
+      </w:r>
+      <w:r>
+        <w:rPr>
+          <w:sz w:val="22"/>
+        </w:rPr>
+        <w:t xml:space="preserve"> (2 pts)</w:t>
+      </w:r>
+    </w:p>
+    <w:p>
+      <w:pPr>
+        <w:spacing w:before="40" w:after="40"/>
+        <w:ind w:left="432"/>
+      </w:pPr>
+      <w:r>
+        <w:rPr>
+          <w:b/>
+          <w:sz w:val="22"/>
+        </w:rPr>
+        <w:t xml:space="preserve">Answer: </w:t>
+      </w:r>
+      <w:r>
+        <w:rPr>
+          <w:b/>
+          <w:sz w:val="22"/>
+        </w:rPr>
+        <w:t>b</w:t>
+      </w:r>
+    </w:p>
+    <w:p>
+      <w:pPr>
         <w:spacing w:before="20" w:after="20"/>
         <w:ind w:left="720"/>
       </w:pPr>
@@ -1501,42 +2478,100 @@
         <w:rPr>
           <w:sz w:val="22"/>
         </w:rPr>
-        <w:t>d. student</w:t>
+        <w:t>a. Three</w:t>
       </w:r>
       <w:r>
         <w:rPr>
           <w:i/>
           <w:sz w:val="20"/>
         </w:rPr>
-        <w:t xml:space="preserve"> — noun</w:t>
+        <w:t xml:space="preserve"> — determiner</w:t>
       </w:r>
     </w:p>
     <w:p>
       <w:pPr>
-        <w:spacing w:before="120" w:after="40"/>
+        <w:spacing w:before="20" w:after="20"/>
+        <w:ind w:left="720"/>
       </w:pPr>
       <w:r>
         <w:rPr>
           <w:b/>
           <w:sz w:val="22"/>
         </w:rPr>
-        <w:t xml:space="preserve">Question 13: </w:t>
-      </w:r>
-      <w:r>
-        <w:rPr>
-          <w:sz w:val="22"/>
-        </w:rPr>
-        <w:t>"The professor entered the room and placed her notes on the desk." What is the antecedent of "her"?</w:t>
-      </w:r>
-      <w:r>
-        <w:rPr>
-          <w:sz w:val="22"/>
-        </w:rPr>
-        <w:t xml:space="preserve"> (2 pts)</w:t>
+        <w:t>b. playful</w:t>
+      </w:r>
+      <w:r>
+        <w:rPr>
+          <w:i/>
+          <w:sz w:val="20"/>
+        </w:rPr>
+        <w:t xml:space="preserve"> — adjective (describes a quality; can be modified by "very"; formed with -ful)</w:t>
       </w:r>
     </w:p>
     <w:p>
       <w:pPr>
+        <w:spacing w:before="20" w:after="20"/>
+        <w:ind w:left="720"/>
+      </w:pPr>
+      <w:r>
+        <w:rPr>
+          <w:sz w:val="22"/>
+        </w:rPr>
+        <w:t>c. explored</w:t>
+      </w:r>
+      <w:r>
+        <w:rPr>
+          <w:i/>
+          <w:sz w:val="20"/>
+        </w:rPr>
+        <w:t xml:space="preserve"> — verb</w:t>
+      </w:r>
+    </w:p>
+    <w:p>
+      <w:pPr>
+        <w:spacing w:before="20" w:after="20"/>
+        <w:ind w:left="720"/>
+      </w:pPr>
+      <w:r>
+        <w:rPr>
+          <w:sz w:val="22"/>
+        </w:rPr>
+        <w:t>d. basement</w:t>
+      </w:r>
+      <w:r>
+        <w:rPr>
+          <w:i/>
+          <w:sz w:val="20"/>
+        </w:rPr>
+        <w:t xml:space="preserve"> — noun</w:t>
+      </w:r>
+    </w:p>
+    <w:p>
+      <w:pPr>
+        <w:spacing w:before="120" w:after="40"/>
+      </w:pPr>
+      <w:r>
+        <w:rPr>
+          <w:b/>
+          <w:sz w:val="22"/>
+        </w:rPr>
+        <w:t xml:space="preserve">Question 22: </w:t>
+      </w:r>
+      <w:r>
+        <w:rPr>
+          <w:sz w:val="22"/>
+        </w:rPr>
+        <w:t>"She quickly ran to the store." What type of phrase is "to the store"?</w:t>
+      </w:r>
+      <w:r>
+        <w:rPr>
+          <w:sz w:val="22"/>
+        </w:rPr>
+        <w:t xml:space="preserve"> (2 pts)</w:t>
+      </w:r>
+    </w:p>
+    <w:p>
+      <w:pPr>
         <w:spacing w:before="40" w:after="40"/>
         <w:ind w:left="432"/>
       </w:pPr>
@@ -1552,7 +2587,7 @@
           <w:b/>
           <w:sz w:val="22"/>
         </w:rPr>
-        <w:t>b</w:t>
+        <w:t>d</w:t>
       </w:r>
     </w:p>
     <w:p>
@@ -1564,7 +2599,7 @@
         <w:rPr>
           <w:sz w:val="22"/>
         </w:rPr>
-        <w:t>a. The room</w:t>
+        <w:t>a. Noun phrase</w:t>
       </w:r>
     </w:p>
     <w:p>
@@ -1574,21 +2609,89 @@
       </w:pPr>
       <w:r>
         <w:rPr>
+          <w:sz w:val="22"/>
+        </w:rPr>
+        <w:t>b. Verb phrase</w:t>
+      </w:r>
+    </w:p>
+    <w:p>
+      <w:pPr>
+        <w:spacing w:before="20" w:after="20"/>
+        <w:ind w:left="720"/>
+      </w:pPr>
+      <w:r>
+        <w:rPr>
+          <w:sz w:val="22"/>
+        </w:rPr>
+        <w:t>c. Adjective phrase</w:t>
+      </w:r>
+    </w:p>
+    <w:p>
+      <w:pPr>
+        <w:spacing w:before="20" w:after="20"/>
+        <w:ind w:left="720"/>
+      </w:pPr>
+      <w:r>
+        <w:rPr>
           <w:b/>
           <w:sz w:val="22"/>
         </w:rPr>
-        <w:t>b. The professor</w:t>
+        <w:t>d. Prepositional phrase</w:t>
       </w:r>
       <w:r>
         <w:rPr>
           <w:i/>
           <w:sz w:val="20"/>
         </w:rPr>
-        <w:t xml:space="preserve"> — "her" (third person, singular, feminine) refers back to "The professor."</w:t>
+        <w:t xml:space="preserve"> — Headed by the preposition "to," with "the store" as its NP object.</w:t>
       </w:r>
     </w:p>
     <w:p>
       <w:pPr>
+        <w:spacing w:before="120" w:after="40"/>
+      </w:pPr>
+      <w:r>
+        <w:rPr>
+          <w:b/>
+          <w:sz w:val="22"/>
+        </w:rPr>
+        <w:t xml:space="preserve">Question 23: </w:t>
+      </w:r>
+      <w:r>
+        <w:rPr>
+          <w:sz w:val="22"/>
+        </w:rPr>
+        <w:t>In the phrase "the extremely tall building," what word class does "extremely" belong to?</w:t>
+      </w:r>
+      <w:r>
+        <w:rPr>
+          <w:sz w:val="22"/>
+        </w:rPr>
+        <w:t xml:space="preserve"> (2 pts)</w:t>
+      </w:r>
+    </w:p>
+    <w:p>
+      <w:pPr>
+        <w:spacing w:before="40" w:after="40"/>
+        <w:ind w:left="432"/>
+      </w:pPr>
+      <w:r>
+        <w:rPr>
+          <w:b/>
+          <w:sz w:val="22"/>
+        </w:rPr>
+        <w:t xml:space="preserve">Answer: </w:t>
+      </w:r>
+      <w:r>
+        <w:rPr>
+          <w:b/>
+          <w:sz w:val="22"/>
+        </w:rPr>
+        <w:t>b</w:t>
+      </w:r>
+    </w:p>
+    <w:p>
+      <w:pPr>
         <w:spacing w:before="20" w:after="20"/>
         <w:ind w:left="720"/>
       </w:pPr>
@@ -1596,7 +2699,7 @@
         <w:rPr>
           <w:sz w:val="22"/>
         </w:rPr>
-        <w:t>c. The desk</w:t>
+        <w:t>a. Adjective</w:t>
       </w:r>
     </w:p>
     <w:p>
@@ -1606,13 +2709,45 @@
       </w:pPr>
       <w:r>
         <w:rPr>
+          <w:b/>
           <w:sz w:val="22"/>
         </w:rPr>
-        <w:t>d. her notes</w:t>
+        <w:t>b. Adverb</w:t>
+      </w:r>
+      <w:r>
+        <w:rPr>
+          <w:i/>
+          <w:sz w:val="20"/>
+        </w:rPr>
+        <w:t xml:space="preserve"> — "Extremely" modifies the adjective "tall," telling the degree of tallness.</w:t>
       </w:r>
     </w:p>
     <w:p>
       <w:pPr>
+        <w:spacing w:before="20" w:after="20"/>
+        <w:ind w:left="720"/>
+      </w:pPr>
+      <w:r>
+        <w:rPr>
+          <w:sz w:val="22"/>
+        </w:rPr>
+        <w:t>c. Determiner</w:t>
+      </w:r>
+    </w:p>
+    <w:p>
+      <w:pPr>
+        <w:spacing w:before="20" w:after="20"/>
+        <w:ind w:left="720"/>
+      </w:pPr>
+      <w:r>
+        <w:rPr>
+          <w:sz w:val="22"/>
+        </w:rPr>
+        <w:t>d. Noun</w:t>
+      </w:r>
+    </w:p>
+    <w:p>
+      <w:pPr>
         <w:spacing w:before="120" w:after="40"/>
       </w:pPr>
       <w:r>
@@ -1620,13 +2755,13 @@
           <w:b/>
           <w:sz w:val="22"/>
         </w:rPr>
-        <w:t xml:space="preserve">Question 14: </w:t>
+        <w:t xml:space="preserve">Question 24: </w:t>
       </w:r>
       <w:r>
         <w:rPr>
           <w:sz w:val="22"/>
         </w:rPr>
-        <w:t>Pronouns replace which of the following elements?</w:t>
+        <w:t>In the sentence “The professor from the university in Boston retired last spring,” what word does the prepositional phrase “in Boston” modify?</w:t>
       </w:r>
       <w:r>
         <w:rPr>
@@ -1652,7 +2787,7 @@
           <w:b/>
           <w:sz w:val="22"/>
         </w:rPr>
-        <w:t>b</w:t>
+        <w:t>c</w:t>
       </w:r>
     </w:p>
     <w:p>
@@ -1664,7 +2799,14 @@
         <w:rPr>
           <w:sz w:val="22"/>
         </w:rPr>
-        <w:t>a. Only the head noun</w:t>
+        <w:t>a. professor</w:t>
+      </w:r>
+      <w:r>
+        <w:rPr>
+          <w:i/>
+          <w:sz w:val="20"/>
+        </w:rPr>
+        <w:t xml:space="preserve"> — Incorrect. "professor" is the head of the outer NP, modified by the entire PP "from the university in Boston."</w:t>
       </w:r>
     </w:p>
     <w:p>
@@ -1674,17 +2816,36 @@
       </w:pPr>
       <w:r>
         <w:rPr>
+          <w:sz w:val="22"/>
+        </w:rPr>
+        <w:t>b. spring</w:t>
+      </w:r>
+      <w:r>
+        <w:rPr>
+          <w:i/>
+          <w:sz w:val="20"/>
+        </w:rPr>
+        <w:t xml:space="preserve"> — Incorrect. "spring" is a noun in a separate time expression.</w:t>
+      </w:r>
+    </w:p>
+    <w:p>
+      <w:pPr>
+        <w:spacing w:before="20" w:after="20"/>
+        <w:ind w:left="720"/>
+      </w:pPr>
+      <w:r>
+        <w:rPr>
           <w:b/>
           <w:sz w:val="22"/>
         </w:rPr>
-        <w:t>b. The entire noun phrase</w:t>
+        <w:t>c. university</w:t>
       </w:r>
       <w:r>
         <w:rPr>
           <w:i/>
           <w:sz w:val="20"/>
         </w:rPr>
-        <w:t xml:space="preserve"> — Correct. Pronouns replace the full NP including all modifiers: "the tall student from Ohio" → "she."</w:t>
+        <w:t xml:space="preserve"> — Correct. "in Boston" modifies "university" — the head noun of the NP inside the PP "from the university."</w:t>
       </w:r>
     </w:p>
     <w:p>
@@ -1696,11 +2857,62 @@
         <w:rPr>
           <w:sz w:val="22"/>
         </w:rPr>
-        <w:t>c. Only the determiner and noun</w:t>
+        <w:t>d. retired</w:t>
+      </w:r>
+      <w:r>
+        <w:rPr>
+          <w:i/>
+          <w:sz w:val="20"/>
+        </w:rPr>
+        <w:t xml:space="preserve"> — Incorrect. "retired" is the verb; the PP "in Boston" modifies a noun, not the verb.</w:t>
       </w:r>
     </w:p>
     <w:p>
       <w:pPr>
+        <w:spacing w:before="120" w:after="40"/>
+      </w:pPr>
+      <w:r>
+        <w:rPr>
+          <w:b/>
+          <w:sz w:val="22"/>
+        </w:rPr>
+        <w:t xml:space="preserve">Question 25: </w:t>
+      </w:r>
+      <w:r>
+        <w:rPr>
+          <w:sz w:val="22"/>
+        </w:rPr>
+        <w:t>In the sentence “The remarkably patient nurse explained the procedure slowly,” what word does the adverb “remarkably” modify?</w:t>
+      </w:r>
+      <w:r>
+        <w:rPr>
+          <w:sz w:val="22"/>
+        </w:rPr>
+        <w:t xml:space="preserve"> (2 pts)</w:t>
+      </w:r>
+    </w:p>
+    <w:p>
+      <w:pPr>
+        <w:spacing w:before="40" w:after="40"/>
+        <w:ind w:left="432"/>
+      </w:pPr>
+      <w:r>
+        <w:rPr>
+          <w:b/>
+          <w:sz w:val="22"/>
+        </w:rPr>
+        <w:t xml:space="preserve">Answer: </w:t>
+      </w:r>
+      <w:r>
+        <w:rPr>
+          <w:b/>
+          <w:sz w:val="22"/>
+        </w:rPr>
+        <w:t>d</w:t>
+      </w:r>
+    </w:p>
+    <w:p>
+      <w:pPr>
         <w:spacing w:before="20" w:after="20"/>
         <w:ind w:left="720"/>
       </w:pPr>
@@ -1708,1416 +2920,204 @@
         <w:rPr>
           <w:sz w:val="22"/>
         </w:rPr>
-        <w:t>d. The verb phrase</w:t>
+        <w:t>a. nurse</w:t>
+      </w:r>
+      <w:r>
+        <w:rPr>
+          <w:i/>
+          <w:sz w:val="20"/>
+        </w:rPr>
+        <w:t xml:space="preserve"> — Incorrect. "nurse" is a noun; adverbs do not modify nouns.</w:t>
       </w:r>
     </w:p>
     <w:p>
       <w:pPr>
-        <w:spacing w:before="120" w:after="40"/>
+        <w:spacing w:before="20" w:after="20"/>
+        <w:ind w:left="720"/>
+      </w:pPr>
+      <w:r>
+        <w:rPr>
+          <w:sz w:val="22"/>
+        </w:rPr>
+        <w:t>b. explained</w:t>
+      </w:r>
+      <w:r>
+        <w:rPr>
+          <w:i/>
+          <w:sz w:val="20"/>
+        </w:rPr>
+        <w:t xml:space="preserve"> — Incorrect. "explained" is the verb; "slowly" modifies the verb, not "remarkably."</w:t>
+      </w:r>
+    </w:p>
+    <w:p>
+      <w:pPr>
+        <w:spacing w:before="20" w:after="20"/>
+        <w:ind w:left="720"/>
+      </w:pPr>
+      <w:r>
+        <w:rPr>
+          <w:sz w:val="22"/>
+        </w:rPr>
+        <w:t>c. slowly</w:t>
+      </w:r>
+      <w:r>
+        <w:rPr>
+          <w:i/>
+          <w:sz w:val="20"/>
+        </w:rPr>
+        <w:t xml:space="preserve"> — Incorrect. "slowly" is itself an adverb modifying the verb "explained."</w:t>
+      </w:r>
+    </w:p>
+    <w:p>
+      <w:pPr>
+        <w:spacing w:before="20" w:after="20"/>
+        <w:ind w:left="720"/>
       </w:pPr>
       <w:r>
         <w:rPr>
           <w:b/>
           <w:sz w:val="22"/>
         </w:rPr>
-        <w:t xml:space="preserve">Question 15: </w:t>
-      </w:r>
-      <w:r>
-        <w:rPr>
-          <w:sz w:val="22"/>
-        </w:rPr>
-        <w:t>Which of the following words is a preposition?</w:t>
-      </w:r>
-      <w:r>
-        <w:rPr>
-          <w:sz w:val="22"/>
-        </w:rPr>
-        <w:t xml:space="preserve"> (2 pts)</w:t>
+        <w:t>d. patient</w:t>
+      </w:r>
+      <w:r>
+        <w:rPr>
+          <w:i/>
+          <w:sz w:val="20"/>
+        </w:rPr>
+        <w:t xml:space="preserve"> — Correct. "remarkably" is an adverb modifying the adjective "patient," indicating degree.</w:t>
       </w:r>
     </w:p>
     <w:p>
-      <w:pPr>
-        <w:spacing w:before="40" w:after="40"/>
-        <w:ind w:left="432"/>
-      </w:pPr>
+      <w:r>
+        <w:br w:type="page"/>
+      </w:r>
+    </w:p>
+    <w:p>
+      <w:pPr>
+        <w:pStyle w:val="Heading2"/>
+      </w:pPr>
+      <w:r>
+        <w:rPr>
+          <w:sz w:val="28"/>
+        </w:rPr>
+        <w:t>Section B: Sentence Labeling and Diagramming (50 points)</w:t>
+      </w:r>
+    </w:p>
+    <w:p>
       <w:r>
         <w:rPr>
           <w:b/>
           <w:sz w:val="22"/>
         </w:rPr>
-        <w:t xml:space="preserve">Answer: </w:t>
-      </w:r>
+        <w:t xml:space="preserve">Instructions: </w:t>
+      </w:r>
+      <w:r>
+        <w:rPr>
+          <w:sz w:val="22"/>
+        </w:rPr>
+        <w:t>For each sentence below, take two steps.</w:t>
+      </w:r>
+    </w:p>
+    <w:p>
       <w:r>
         <w:rPr>
           <w:b/>
           <w:sz w:val="22"/>
         </w:rPr>
-        <w:t>c</w:t>
+        <w:t xml:space="preserve">1. </w:t>
+      </w:r>
+      <w:r>
+        <w:rPr>
+          <w:b/>
+          <w:sz w:val="22"/>
+        </w:rPr>
+        <w:t xml:space="preserve">Complete the labeling table </w:t>
+      </w:r>
+      <w:r>
+        <w:rPr>
+          <w:sz w:val="22"/>
+        </w:rPr>
+        <w:t>by filling in the Role, Phrase, and Part of Speech (POS) rows.</w:t>
       </w:r>
     </w:p>
     <w:p>
-      <w:pPr>
-        <w:spacing w:before="20" w:after="20"/>
-        <w:ind w:left="720"/>
-      </w:pPr>
-      <w:r>
-        <w:rPr>
+      <w:r>
+        <w:rPr>
+          <w:b/>
           <w:sz w:val="22"/>
         </w:rPr>
-        <w:t>a. quickly</w:t>
-      </w:r>
-      <w:r>
-        <w:rPr>
-          <w:i/>
-          <w:sz w:val="20"/>
-        </w:rPr>
-        <w:t xml:space="preserve"> — adverb</w:t>
+        <w:t xml:space="preserve">2. </w:t>
+      </w:r>
+      <w:r>
+        <w:rPr>
+          <w:b/>
+          <w:sz w:val="22"/>
+        </w:rPr>
+        <w:t xml:space="preserve">Create a tree diagram </w:t>
+      </w:r>
+      <w:r>
+        <w:rPr>
+          <w:sz w:val="22"/>
+        </w:rPr>
+        <w:t>of the sentence. You may use any diagramming tool of your choice: SyntaxTreeHybrid, by hand on paper, or by hand on a tablet.</w:t>
       </w:r>
     </w:p>
     <w:p>
-      <w:pPr>
-        <w:spacing w:before="20" w:after="20"/>
-        <w:ind w:left="720"/>
-      </w:pPr>
-      <w:r>
-        <w:rPr>
-          <w:sz w:val="22"/>
-        </w:rPr>
-        <w:t>b. beautiful</w:t>
-      </w:r>
-      <w:r>
-        <w:rPr>
-          <w:i/>
+      <w:r>
+        <w:rPr>
+          <w:b/>
           <w:sz w:val="20"/>
         </w:rPr>
-        <w:t xml:space="preserve"> — adjective</w:t>
+        <w:t>Scoring (per sentence):</w:t>
       </w:r>
     </w:p>
     <w:p>
       <w:pPr>
-        <w:spacing w:before="20" w:after="20"/>
-        <w:ind w:left="720"/>
-      </w:pPr>
-      <w:r>
-        <w:rPr>
-          <w:b/>
-          <w:sz w:val="22"/>
-        </w:rPr>
-        <w:t>c. through</w:t>
-      </w:r>
-      <w:r>
-        <w:rPr>
-          <w:i/>
+        <w:pStyle w:val="ListBullet"/>
+      </w:pPr>
+      <w:r/>
+      <w:r>
+        <w:rPr>
           <w:sz w:val="20"/>
         </w:rPr>
-        <w:t xml:space="preserve"> — preposition</w:t>
+        <w:t>4 points — Correct Parts of Speech</w:t>
       </w:r>
     </w:p>
     <w:p>
       <w:pPr>
-        <w:spacing w:before="20" w:after="20"/>
-        <w:ind w:left="720"/>
-      </w:pPr>
-      <w:r>
-        <w:rPr>
-          <w:sz w:val="22"/>
-        </w:rPr>
-        <w:t>d. they</w:t>
-      </w:r>
-      <w:r>
-        <w:rPr>
-          <w:i/>
+        <w:pStyle w:val="ListBullet"/>
+      </w:pPr>
+      <w:r/>
+      <w:r>
+        <w:rPr>
           <w:sz w:val="20"/>
         </w:rPr>
-        <w:t xml:space="preserve"> — pronoun</w:t>
+        <w:t>3 points — Correct Phrase labels</w:t>
       </w:r>
     </w:p>
     <w:p>
       <w:pPr>
-        <w:spacing w:before="120" w:after="40"/>
-      </w:pPr>
-      <w:r>
-        <w:rPr>
-          <w:b/>
-          <w:sz w:val="22"/>
-        </w:rPr>
-        <w:t xml:space="preserve">Question 16: </w:t>
-      </w:r>
-      <w:r>
-        <w:rPr>
-          <w:sz w:val="22"/>
-        </w:rPr>
-        <w:t>Which of the following is NOT a determiner?</w:t>
-      </w:r>
-      <w:r>
-        <w:rPr>
-          <w:sz w:val="22"/>
-        </w:rPr>
-        <w:t xml:space="preserve"> (2 pts)</w:t>
+        <w:pStyle w:val="ListBullet"/>
+      </w:pPr>
+      <w:r/>
+      <w:r>
+        <w:rPr>
+          <w:sz w:val="20"/>
+        </w:rPr>
+        <w:t>1 point — Correct Role labels (Subject, Predicate)</w:t>
       </w:r>
     </w:p>
     <w:p>
       <w:pPr>
-        <w:spacing w:before="40" w:after="40"/>
-        <w:ind w:left="432"/>
-      </w:pPr>
-      <w:r>
-        <w:rPr>
-          <w:b/>
-          <w:sz w:val="22"/>
-        </w:rPr>
-        <w:t xml:space="preserve">Answer: </w:t>
-      </w:r>
-      <w:r>
-        <w:rPr>
-          <w:b/>
-          <w:sz w:val="22"/>
-        </w:rPr>
-        <w:t>c</w:t>
-      </w:r>
-    </w:p>
-    <w:p>
-      <w:pPr>
-        <w:spacing w:before="20" w:after="20"/>
-        <w:ind w:left="720"/>
-      </w:pPr>
-      <w:r>
-        <w:rPr>
-          <w:sz w:val="22"/>
-        </w:rPr>
-        <w:t>a. the</w:t>
-      </w:r>
-      <w:r>
-        <w:rPr>
-          <w:i/>
+        <w:pStyle w:val="ListBullet"/>
+      </w:pPr>
+      <w:r/>
+      <w:r>
+        <w:rPr>
           <w:sz w:val="20"/>
         </w:rPr>
-        <w:t xml:space="preserve"> — determiner</w:t>
-      </w:r>
-    </w:p>
-    <w:p>
-      <w:pPr>
-        <w:spacing w:before="20" w:after="20"/>
-        <w:ind w:left="720"/>
-      </w:pPr>
-      <w:r>
-        <w:rPr>
-          <w:sz w:val="22"/>
-        </w:rPr>
-        <w:t>b. every</w:t>
-      </w:r>
-      <w:r>
-        <w:rPr>
-          <w:i/>
-          <w:sz w:val="20"/>
-        </w:rPr>
-        <w:t xml:space="preserve"> — determiner</w:t>
-      </w:r>
-    </w:p>
-    <w:p>
-      <w:pPr>
-        <w:spacing w:before="20" w:after="20"/>
-        <w:ind w:left="720"/>
-      </w:pPr>
-      <w:r>
-        <w:rPr>
-          <w:b/>
-          <w:sz w:val="22"/>
-        </w:rPr>
-        <w:t>c. very</w:t>
-      </w:r>
-      <w:r>
-        <w:rPr>
-          <w:i/>
-          <w:sz w:val="20"/>
-        </w:rPr>
-        <w:t xml:space="preserve"> — adverb (modifies adjectives and adverbs, not nouns)</w:t>
-      </w:r>
-    </w:p>
-    <w:p>
-      <w:pPr>
-        <w:spacing w:before="20" w:after="20"/>
-        <w:ind w:left="720"/>
-      </w:pPr>
-      <w:r>
-        <w:rPr>
-          <w:sz w:val="22"/>
-        </w:rPr>
-        <w:t>d. some</w:t>
-      </w:r>
-      <w:r>
-        <w:rPr>
-          <w:i/>
-          <w:sz w:val="20"/>
-        </w:rPr>
-        <w:t xml:space="preserve"> — determiner</w:t>
-      </w:r>
-    </w:p>
-    <w:p>
-      <w:pPr>
-        <w:pStyle w:val="Heading3"/>
-      </w:pPr>
-      <w:r>
-        <w:rPr>
-          <w:sz w:val="24"/>
-        </w:rPr>
-        <w:t>Section A3: Parts of Speech in Context (Questions 17–25, 18 points)</w:t>
-      </w:r>
-    </w:p>
-    <w:p>
-      <w:pPr>
-        <w:spacing w:before="80" w:after="80"/>
-      </w:pPr>
-      <w:r>
-        <w:rPr>
-          <w:i/>
-          <w:sz w:val="22"/>
-        </w:rPr>
-        <w:t>Sentence for Questions 17–18: "Several enthusiastic students quietly studied the challenging material."</w:t>
-      </w:r>
-    </w:p>
-    <w:p>
-      <w:pPr>
-        <w:spacing w:before="120" w:after="40"/>
-      </w:pPr>
-      <w:r>
-        <w:rPr>
-          <w:b/>
-          <w:sz w:val="22"/>
-        </w:rPr>
-        <w:t xml:space="preserve">Question 17: </w:t>
-      </w:r>
-      <w:r>
-        <w:rPr>
-          <w:sz w:val="22"/>
-        </w:rPr>
-        <w:t>Which word in the sentence above is a determiner?</w:t>
-      </w:r>
-      <w:r>
-        <w:rPr>
-          <w:sz w:val="22"/>
-        </w:rPr>
-        <w:t xml:space="preserve"> (2 pts)</w:t>
-      </w:r>
-    </w:p>
-    <w:p>
-      <w:pPr>
-        <w:spacing w:before="40" w:after="40"/>
-        <w:ind w:left="432"/>
-      </w:pPr>
-      <w:r>
-        <w:rPr>
-          <w:b/>
-          <w:sz w:val="22"/>
-        </w:rPr>
-        <w:t xml:space="preserve">Answer: </w:t>
-      </w:r>
-      <w:r>
-        <w:rPr>
-          <w:b/>
-          <w:sz w:val="22"/>
-        </w:rPr>
-        <w:t>b</w:t>
-      </w:r>
-    </w:p>
-    <w:p>
-      <w:pPr>
-        <w:spacing w:before="20" w:after="20"/>
-        <w:ind w:left="720"/>
-      </w:pPr>
-      <w:r>
-        <w:rPr>
-          <w:sz w:val="22"/>
-        </w:rPr>
-        <w:t>a. enthusiastic</w:t>
-      </w:r>
-      <w:r>
-        <w:rPr>
-          <w:i/>
-          <w:sz w:val="20"/>
-        </w:rPr>
-        <w:t xml:space="preserve"> — adjective</w:t>
-      </w:r>
-    </w:p>
-    <w:p>
-      <w:pPr>
-        <w:spacing w:before="20" w:after="20"/>
-        <w:ind w:left="720"/>
-      </w:pPr>
-      <w:r>
-        <w:rPr>
-          <w:b/>
-          <w:sz w:val="22"/>
-        </w:rPr>
-        <w:t>b. Several</w:t>
-      </w:r>
-      <w:r>
-        <w:rPr>
-          <w:i/>
-          <w:sz w:val="20"/>
-        </w:rPr>
-        <w:t xml:space="preserve"> — determiner (indicates amount; cannot be modified by "very"; appears before adjectives)</w:t>
-      </w:r>
-    </w:p>
-    <w:p>
-      <w:pPr>
-        <w:spacing w:before="20" w:after="20"/>
-        <w:ind w:left="720"/>
-      </w:pPr>
-      <w:r>
-        <w:rPr>
-          <w:sz w:val="22"/>
-        </w:rPr>
-        <w:t>c. quietly</w:t>
-      </w:r>
-      <w:r>
-        <w:rPr>
-          <w:i/>
-          <w:sz w:val="20"/>
-        </w:rPr>
-        <w:t xml:space="preserve"> — adverb</w:t>
-      </w:r>
-    </w:p>
-    <w:p>
-      <w:pPr>
-        <w:spacing w:before="20" w:after="20"/>
-        <w:ind w:left="720"/>
-      </w:pPr>
-      <w:r>
-        <w:rPr>
-          <w:sz w:val="22"/>
-        </w:rPr>
-        <w:t>d. challenging</w:t>
-      </w:r>
-      <w:r>
-        <w:rPr>
-          <w:i/>
-          <w:sz w:val="20"/>
-        </w:rPr>
-        <w:t xml:space="preserve"> — adjective</w:t>
-      </w:r>
-    </w:p>
-    <w:p>
-      <w:pPr>
-        <w:spacing w:before="120" w:after="40"/>
-      </w:pPr>
-      <w:r>
-        <w:rPr>
-          <w:b/>
-          <w:sz w:val="22"/>
-        </w:rPr>
-        <w:t xml:space="preserve">Question 18: </w:t>
-      </w:r>
-      <w:r>
-        <w:rPr>
-          <w:sz w:val="22"/>
-        </w:rPr>
-        <w:t>Which word in the sentence above is an adverb?</w:t>
-      </w:r>
-      <w:r>
-        <w:rPr>
-          <w:sz w:val="22"/>
-        </w:rPr>
-        <w:t xml:space="preserve"> (2 pts)</w:t>
-      </w:r>
-    </w:p>
-    <w:p>
-      <w:pPr>
-        <w:spacing w:before="40" w:after="40"/>
-        <w:ind w:left="432"/>
-      </w:pPr>
-      <w:r>
-        <w:rPr>
-          <w:b/>
-          <w:sz w:val="22"/>
-        </w:rPr>
-        <w:t xml:space="preserve">Answer: </w:t>
-      </w:r>
-      <w:r>
-        <w:rPr>
-          <w:b/>
-          <w:sz w:val="22"/>
-        </w:rPr>
-        <w:t>c</w:t>
-      </w:r>
-    </w:p>
-    <w:p>
-      <w:pPr>
-        <w:spacing w:before="20" w:after="20"/>
-        <w:ind w:left="720"/>
-      </w:pPr>
-      <w:r>
-        <w:rPr>
-          <w:sz w:val="22"/>
-        </w:rPr>
-        <w:t>a. Several</w:t>
-      </w:r>
-      <w:r>
-        <w:rPr>
-          <w:i/>
-          <w:sz w:val="20"/>
-        </w:rPr>
-        <w:t xml:space="preserve"> — determiner</w:t>
-      </w:r>
-    </w:p>
-    <w:p>
-      <w:pPr>
-        <w:spacing w:before="20" w:after="20"/>
-        <w:ind w:left="720"/>
-      </w:pPr>
-      <w:r>
-        <w:rPr>
-          <w:sz w:val="22"/>
-        </w:rPr>
-        <w:t>b. enthusiastic</w:t>
-      </w:r>
-      <w:r>
-        <w:rPr>
-          <w:i/>
-          <w:sz w:val="20"/>
-        </w:rPr>
-        <w:t xml:space="preserve"> — adjective</w:t>
-      </w:r>
-    </w:p>
-    <w:p>
-      <w:pPr>
-        <w:spacing w:before="20" w:after="20"/>
-        <w:ind w:left="720"/>
-      </w:pPr>
-      <w:r>
-        <w:rPr>
-          <w:b/>
-          <w:sz w:val="22"/>
-        </w:rPr>
-        <w:t>c. quietly</w:t>
-      </w:r>
-      <w:r>
-        <w:rPr>
-          <w:i/>
-          <w:sz w:val="20"/>
-        </w:rPr>
-        <w:t xml:space="preserve"> — adverb (modifies the verb "studied"; formed with -ly from quiet)</w:t>
-      </w:r>
-    </w:p>
-    <w:p>
-      <w:pPr>
-        <w:spacing w:before="20" w:after="20"/>
-        <w:ind w:left="720"/>
-      </w:pPr>
-      <w:r>
-        <w:rPr>
-          <w:sz w:val="22"/>
-        </w:rPr>
-        <w:t>d. material</w:t>
-      </w:r>
-      <w:r>
-        <w:rPr>
-          <w:i/>
-          <w:sz w:val="20"/>
-        </w:rPr>
-        <w:t xml:space="preserve"> — noun</w:t>
-      </w:r>
-    </w:p>
-    <w:p>
-      <w:pPr>
-        <w:spacing w:before="120" w:after="40"/>
-      </w:pPr>
-      <w:r>
-        <w:rPr>
-          <w:b/>
-          <w:sz w:val="22"/>
-        </w:rPr>
-        <w:t xml:space="preserve">Question 19: </w:t>
-      </w:r>
-      <w:r>
-        <w:rPr>
-          <w:sz w:val="22"/>
-        </w:rPr>
-        <w:t>"The professor with the briefcase lectured brilliantly." What part of speech is "with"?</w:t>
-      </w:r>
-      <w:r>
-        <w:rPr>
-          <w:sz w:val="22"/>
-        </w:rPr>
-        <w:t xml:space="preserve"> (2 pts)</w:t>
-      </w:r>
-    </w:p>
-    <w:p>
-      <w:pPr>
-        <w:spacing w:before="40" w:after="40"/>
-        <w:ind w:left="432"/>
-      </w:pPr>
-      <w:r>
-        <w:rPr>
-          <w:b/>
-          <w:sz w:val="22"/>
-        </w:rPr>
-        <w:t xml:space="preserve">Answer: </w:t>
-      </w:r>
-      <w:r>
-        <w:rPr>
-          <w:b/>
-          <w:sz w:val="22"/>
-        </w:rPr>
-        <w:t>c</w:t>
-      </w:r>
-    </w:p>
-    <w:p>
-      <w:pPr>
-        <w:spacing w:before="20" w:after="20"/>
-        <w:ind w:left="720"/>
-      </w:pPr>
-      <w:r>
-        <w:rPr>
-          <w:sz w:val="22"/>
-        </w:rPr>
-        <w:t>a. Conjunction</w:t>
-      </w:r>
-    </w:p>
-    <w:p>
-      <w:pPr>
-        <w:spacing w:before="20" w:after="20"/>
-        <w:ind w:left="720"/>
-      </w:pPr>
-      <w:r>
-        <w:rPr>
-          <w:sz w:val="22"/>
-        </w:rPr>
-        <w:t>b. Determiner</w:t>
-      </w:r>
-    </w:p>
-    <w:p>
-      <w:pPr>
-        <w:spacing w:before="20" w:after="20"/>
-        <w:ind w:left="720"/>
-      </w:pPr>
-      <w:r>
-        <w:rPr>
-          <w:b/>
-          <w:sz w:val="22"/>
-        </w:rPr>
-        <w:t>c. Preposition</w:t>
-      </w:r>
-      <w:r>
-        <w:rPr>
-          <w:i/>
-          <w:sz w:val="20"/>
-        </w:rPr>
-        <w:t xml:space="preserve"> — "With" introduces the prepositional phrase "with the briefcase."</w:t>
-      </w:r>
-    </w:p>
-    <w:p>
-      <w:pPr>
-        <w:spacing w:before="20" w:after="20"/>
-        <w:ind w:left="720"/>
-      </w:pPr>
-      <w:r>
-        <w:rPr>
-          <w:sz w:val="22"/>
-        </w:rPr>
-        <w:t>d. Adverb</w:t>
-      </w:r>
-    </w:p>
-    <w:p>
-      <w:pPr>
-        <w:spacing w:before="120" w:after="40"/>
-      </w:pPr>
-      <w:r>
-        <w:rPr>
-          <w:b/>
-          <w:sz w:val="22"/>
-        </w:rPr>
-        <w:t xml:space="preserve">Question 20: </w:t>
-      </w:r>
-      <w:r>
-        <w:rPr>
-          <w:sz w:val="22"/>
-        </w:rPr>
-        <w:t>"My sister carefully examined their proposal." Which word is functioning as a verb?</w:t>
-      </w:r>
-      <w:r>
-        <w:rPr>
-          <w:sz w:val="22"/>
-        </w:rPr>
-        <w:t xml:space="preserve"> (2 pts)</w:t>
-      </w:r>
-    </w:p>
-    <w:p>
-      <w:pPr>
-        <w:spacing w:before="40" w:after="40"/>
-        <w:ind w:left="432"/>
-      </w:pPr>
-      <w:r>
-        <w:rPr>
-          <w:b/>
-          <w:sz w:val="22"/>
-        </w:rPr>
-        <w:t xml:space="preserve">Answer: </w:t>
-      </w:r>
-      <w:r>
-        <w:rPr>
-          <w:b/>
-          <w:sz w:val="22"/>
-        </w:rPr>
-        <w:t>d</w:t>
-      </w:r>
-    </w:p>
-    <w:p>
-      <w:pPr>
-        <w:spacing w:before="20" w:after="20"/>
-        <w:ind w:left="720"/>
-      </w:pPr>
-      <w:r>
-        <w:rPr>
-          <w:sz w:val="22"/>
-        </w:rPr>
-        <w:t>a. My</w:t>
-      </w:r>
-      <w:r>
-        <w:rPr>
-          <w:i/>
-          <w:sz w:val="20"/>
-        </w:rPr>
-        <w:t xml:space="preserve"> — determiner</w:t>
-      </w:r>
-    </w:p>
-    <w:p>
-      <w:pPr>
-        <w:spacing w:before="20" w:after="20"/>
-        <w:ind w:left="720"/>
-      </w:pPr>
-      <w:r>
-        <w:rPr>
-          <w:sz w:val="22"/>
-        </w:rPr>
-        <w:t>b. sister</w:t>
-      </w:r>
-      <w:r>
-        <w:rPr>
-          <w:i/>
-          <w:sz w:val="20"/>
-        </w:rPr>
-        <w:t xml:space="preserve"> — noun</w:t>
-      </w:r>
-    </w:p>
-    <w:p>
-      <w:pPr>
-        <w:spacing w:before="20" w:after="20"/>
-        <w:ind w:left="720"/>
-      </w:pPr>
-      <w:r>
-        <w:rPr>
-          <w:sz w:val="22"/>
-        </w:rPr>
-        <w:t>c. carefully</w:t>
-      </w:r>
-      <w:r>
-        <w:rPr>
-          <w:i/>
-          <w:sz w:val="20"/>
-        </w:rPr>
-        <w:t xml:space="preserve"> — adverb</w:t>
-      </w:r>
-    </w:p>
-    <w:p>
-      <w:pPr>
-        <w:spacing w:before="20" w:after="20"/>
-        <w:ind w:left="720"/>
-      </w:pPr>
-      <w:r>
-        <w:rPr>
-          <w:b/>
-          <w:sz w:val="22"/>
-        </w:rPr>
-        <w:t>d. examined</w:t>
-      </w:r>
-      <w:r>
-        <w:rPr>
-          <w:i/>
-          <w:sz w:val="20"/>
-        </w:rPr>
-        <w:t xml:space="preserve"> — verb (the main action; takes past tense -ed)</w:t>
-      </w:r>
-    </w:p>
-    <w:p>
-      <w:pPr>
-        <w:spacing w:before="120" w:after="40"/>
-      </w:pPr>
-      <w:r>
-        <w:rPr>
-          <w:b/>
-          <w:sz w:val="22"/>
-        </w:rPr>
-        <w:t xml:space="preserve">Question 21: </w:t>
-      </w:r>
-      <w:r>
-        <w:rPr>
-          <w:sz w:val="22"/>
-        </w:rPr>
-        <w:t>"Three playful kittens explored the mysterious basement." Which word is an adjective?</w:t>
-      </w:r>
-      <w:r>
-        <w:rPr>
-          <w:sz w:val="22"/>
-        </w:rPr>
-        <w:t xml:space="preserve"> (2 pts)</w:t>
-      </w:r>
-    </w:p>
-    <w:p>
-      <w:pPr>
-        <w:spacing w:before="40" w:after="40"/>
-        <w:ind w:left="432"/>
-      </w:pPr>
-      <w:r>
-        <w:rPr>
-          <w:b/>
-          <w:sz w:val="22"/>
-        </w:rPr>
-        <w:t xml:space="preserve">Answer: </w:t>
-      </w:r>
-      <w:r>
-        <w:rPr>
-          <w:b/>
-          <w:sz w:val="22"/>
-        </w:rPr>
-        <w:t>b</w:t>
-      </w:r>
-    </w:p>
-    <w:p>
-      <w:pPr>
-        <w:spacing w:before="20" w:after="20"/>
-        <w:ind w:left="720"/>
-      </w:pPr>
-      <w:r>
-        <w:rPr>
-          <w:sz w:val="22"/>
-        </w:rPr>
-        <w:t>a. Three</w:t>
-      </w:r>
-      <w:r>
-        <w:rPr>
-          <w:i/>
-          <w:sz w:val="20"/>
-        </w:rPr>
-        <w:t xml:space="preserve"> — determiner</w:t>
-      </w:r>
-    </w:p>
-    <w:p>
-      <w:pPr>
-        <w:spacing w:before="20" w:after="20"/>
-        <w:ind w:left="720"/>
-      </w:pPr>
-      <w:r>
-        <w:rPr>
-          <w:b/>
-          <w:sz w:val="22"/>
-        </w:rPr>
-        <w:t>b. playful</w:t>
-      </w:r>
-      <w:r>
-        <w:rPr>
-          <w:i/>
-          <w:sz w:val="20"/>
-        </w:rPr>
-        <w:t xml:space="preserve"> — adjective (describes a quality; can be modified by "very"; formed with -ful)</w:t>
-      </w:r>
-    </w:p>
-    <w:p>
-      <w:pPr>
-        <w:spacing w:before="20" w:after="20"/>
-        <w:ind w:left="720"/>
-      </w:pPr>
-      <w:r>
-        <w:rPr>
-          <w:sz w:val="22"/>
-        </w:rPr>
-        <w:t>c. explored</w:t>
-      </w:r>
-      <w:r>
-        <w:rPr>
-          <w:i/>
-          <w:sz w:val="20"/>
-        </w:rPr>
-        <w:t xml:space="preserve"> — verb</w:t>
-      </w:r>
-    </w:p>
-    <w:p>
-      <w:pPr>
-        <w:spacing w:before="20" w:after="20"/>
-        <w:ind w:left="720"/>
-      </w:pPr>
-      <w:r>
-        <w:rPr>
-          <w:sz w:val="22"/>
-        </w:rPr>
-        <w:t>d. basement</w:t>
-      </w:r>
-      <w:r>
-        <w:rPr>
-          <w:i/>
-          <w:sz w:val="20"/>
-        </w:rPr>
-        <w:t xml:space="preserve"> — noun</w:t>
-      </w:r>
-    </w:p>
-    <w:p>
-      <w:pPr>
-        <w:spacing w:before="120" w:after="40"/>
-      </w:pPr>
-      <w:r>
-        <w:rPr>
-          <w:b/>
-          <w:sz w:val="22"/>
-        </w:rPr>
-        <w:t xml:space="preserve">Question 22: </w:t>
-      </w:r>
-      <w:r>
-        <w:rPr>
-          <w:sz w:val="22"/>
-        </w:rPr>
-        <w:t>"She quickly ran to the store." What type of phrase is "to the store"?</w:t>
-      </w:r>
-      <w:r>
-        <w:rPr>
-          <w:sz w:val="22"/>
-        </w:rPr>
-        <w:t xml:space="preserve"> (2 pts)</w:t>
-      </w:r>
-    </w:p>
-    <w:p>
-      <w:pPr>
-        <w:spacing w:before="40" w:after="40"/>
-        <w:ind w:left="432"/>
-      </w:pPr>
-      <w:r>
-        <w:rPr>
-          <w:b/>
-          <w:sz w:val="22"/>
-        </w:rPr>
-        <w:t xml:space="preserve">Answer: </w:t>
-      </w:r>
-      <w:r>
-        <w:rPr>
-          <w:b/>
-          <w:sz w:val="22"/>
-        </w:rPr>
-        <w:t>d</w:t>
-      </w:r>
-    </w:p>
-    <w:p>
-      <w:pPr>
-        <w:spacing w:before="20" w:after="20"/>
-        <w:ind w:left="720"/>
-      </w:pPr>
-      <w:r>
-        <w:rPr>
-          <w:sz w:val="22"/>
-        </w:rPr>
-        <w:t>a. Noun phrase</w:t>
-      </w:r>
-    </w:p>
-    <w:p>
-      <w:pPr>
-        <w:spacing w:before="20" w:after="20"/>
-        <w:ind w:left="720"/>
-      </w:pPr>
-      <w:r>
-        <w:rPr>
-          <w:sz w:val="22"/>
-        </w:rPr>
-        <w:t>b. Verb phrase</w:t>
-      </w:r>
-    </w:p>
-    <w:p>
-      <w:pPr>
-        <w:spacing w:before="20" w:after="20"/>
-        <w:ind w:left="720"/>
-      </w:pPr>
-      <w:r>
-        <w:rPr>
-          <w:sz w:val="22"/>
-        </w:rPr>
-        <w:t>c. Adjective phrase</w:t>
-      </w:r>
-    </w:p>
-    <w:p>
-      <w:pPr>
-        <w:spacing w:before="20" w:after="20"/>
-        <w:ind w:left="720"/>
-      </w:pPr>
-      <w:r>
-        <w:rPr>
-          <w:b/>
-          <w:sz w:val="22"/>
-        </w:rPr>
-        <w:t>d. Prepositional phrase</w:t>
-      </w:r>
-      <w:r>
-        <w:rPr>
-          <w:i/>
-          <w:sz w:val="20"/>
-        </w:rPr>
-        <w:t xml:space="preserve"> — Headed by the preposition "to," with "the store" as its NP object.</w:t>
-      </w:r>
-    </w:p>
-    <w:p>
-      <w:pPr>
-        <w:spacing w:before="120" w:after="40"/>
-      </w:pPr>
-      <w:r>
-        <w:rPr>
-          <w:b/>
-          <w:sz w:val="22"/>
-        </w:rPr>
-        <w:t xml:space="preserve">Question 23: </w:t>
-      </w:r>
-      <w:r>
-        <w:rPr>
-          <w:sz w:val="22"/>
-        </w:rPr>
-        <w:t>In the phrase "the extremely tall building," what word class does "extremely" belong to?</w:t>
-      </w:r>
-      <w:r>
-        <w:rPr>
-          <w:sz w:val="22"/>
-        </w:rPr>
-        <w:t xml:space="preserve"> (2 pts)</w:t>
-      </w:r>
-    </w:p>
-    <w:p>
-      <w:pPr>
-        <w:spacing w:before="40" w:after="40"/>
-        <w:ind w:left="432"/>
-      </w:pPr>
-      <w:r>
-        <w:rPr>
-          <w:b/>
-          <w:sz w:val="22"/>
-        </w:rPr>
-        <w:t xml:space="preserve">Answer: </w:t>
-      </w:r>
-      <w:r>
-        <w:rPr>
-          <w:b/>
-          <w:sz w:val="22"/>
-        </w:rPr>
-        <w:t>b</w:t>
-      </w:r>
-    </w:p>
-    <w:p>
-      <w:pPr>
-        <w:spacing w:before="20" w:after="20"/>
-        <w:ind w:left="720"/>
-      </w:pPr>
-      <w:r>
-        <w:rPr>
-          <w:sz w:val="22"/>
-        </w:rPr>
-        <w:t>a. Adjective</w:t>
-      </w:r>
-    </w:p>
-    <w:p>
-      <w:pPr>
-        <w:spacing w:before="20" w:after="20"/>
-        <w:ind w:left="720"/>
-      </w:pPr>
-      <w:r>
-        <w:rPr>
-          <w:b/>
-          <w:sz w:val="22"/>
-        </w:rPr>
-        <w:t>b. Adverb</w:t>
-      </w:r>
-      <w:r>
-        <w:rPr>
-          <w:i/>
-          <w:sz w:val="20"/>
-        </w:rPr>
-        <w:t xml:space="preserve"> — "Extremely" modifies the adjective "tall," telling the degree of tallness.</w:t>
-      </w:r>
-    </w:p>
-    <w:p>
-      <w:pPr>
-        <w:spacing w:before="20" w:after="20"/>
-        <w:ind w:left="720"/>
-      </w:pPr>
-      <w:r>
-        <w:rPr>
-          <w:sz w:val="22"/>
-        </w:rPr>
-        <w:t>c. Determiner</w:t>
-      </w:r>
-    </w:p>
-    <w:p>
-      <w:pPr>
-        <w:spacing w:before="20" w:after="20"/>
-        <w:ind w:left="720"/>
-      </w:pPr>
-      <w:r>
-        <w:rPr>
-          <w:sz w:val="22"/>
-        </w:rPr>
-        <w:t>d. Noun</w:t>
-      </w:r>
-    </w:p>
-    <w:p>
-      <w:pPr>
-        <w:spacing w:before="120" w:after="40"/>
-      </w:pPr>
-      <w:r>
-        <w:rPr>
-          <w:b/>
-          <w:sz w:val="22"/>
-        </w:rPr>
-        <w:t xml:space="preserve">Question 24: </w:t>
-      </w:r>
-      <w:r>
-        <w:rPr>
-          <w:sz w:val="22"/>
-        </w:rPr>
-        <w:t>Which test reliably distinguishes adjectives from determiners?</w:t>
-      </w:r>
-      <w:r>
-        <w:rPr>
-          <w:sz w:val="22"/>
-        </w:rPr>
-        <w:t xml:space="preserve"> (2 pts)</w:t>
-      </w:r>
-    </w:p>
-    <w:p>
-      <w:pPr>
-        <w:spacing w:before="40" w:after="40"/>
-        <w:ind w:left="432"/>
-      </w:pPr>
-      <w:r>
-        <w:rPr>
-          <w:b/>
-          <w:sz w:val="22"/>
-        </w:rPr>
-        <w:t xml:space="preserve">Answer: </w:t>
-      </w:r>
-      <w:r>
-        <w:rPr>
-          <w:b/>
-          <w:sz w:val="22"/>
-        </w:rPr>
-        <w:t>b</w:t>
-      </w:r>
-    </w:p>
-    <w:p>
-      <w:pPr>
-        <w:spacing w:before="20" w:after="20"/>
-        <w:ind w:left="720"/>
-      </w:pPr>
-      <w:r>
-        <w:rPr>
-          <w:sz w:val="22"/>
-        </w:rPr>
-        <w:t>a. Adjectives can be pluralized</w:t>
-      </w:r>
-      <w:r>
-        <w:rPr>
-          <w:i/>
-          <w:sz w:val="20"/>
-        </w:rPr>
-        <w:t xml:space="preserve"> — Incorrect. Nouns are pluralized, not adjectives.</w:t>
-      </w:r>
-    </w:p>
-    <w:p>
-      <w:pPr>
-        <w:spacing w:before="20" w:after="20"/>
-        <w:ind w:left="720"/>
-      </w:pPr>
-      <w:r>
-        <w:rPr>
-          <w:b/>
-          <w:sz w:val="22"/>
-        </w:rPr>
-        <w:t>b. Adjectives can be modified by "very"</w:t>
-      </w:r>
-      <w:r>
-        <w:rPr>
-          <w:i/>
-          <w:sz w:val="20"/>
-        </w:rPr>
-        <w:t xml:space="preserve"> — Correct. "Very tall" but not "very the" or "very my."</w:t>
-      </w:r>
-    </w:p>
-    <w:p>
-      <w:pPr>
-        <w:spacing w:before="20" w:after="20"/>
-        <w:ind w:left="720"/>
-      </w:pPr>
-      <w:r>
-        <w:rPr>
-          <w:sz w:val="22"/>
-        </w:rPr>
-        <w:t>c. Adjectives always appear after the noun</w:t>
-      </w:r>
-      <w:r>
-        <w:rPr>
-          <w:i/>
-          <w:sz w:val="20"/>
-        </w:rPr>
-        <w:t xml:space="preserve"> — Incorrect. Adjectives typically appear before the noun.</w:t>
-      </w:r>
-    </w:p>
-    <w:p>
-      <w:pPr>
-        <w:spacing w:before="20" w:after="20"/>
-        <w:ind w:left="720"/>
-      </w:pPr>
-      <w:r>
-        <w:rPr>
-          <w:sz w:val="22"/>
-        </w:rPr>
-        <w:t>d. Adjectives cannot appear before nouns</w:t>
-      </w:r>
-      <w:r>
-        <w:rPr>
-          <w:i/>
-          <w:sz w:val="20"/>
-        </w:rPr>
-        <w:t xml:space="preserve"> — Incorrect. Adjectives routinely appear before nouns.</w:t>
-      </w:r>
-    </w:p>
-    <w:p>
-      <w:pPr>
-        <w:spacing w:before="120" w:after="40"/>
-      </w:pPr>
-      <w:r>
-        <w:rPr>
-          <w:b/>
-          <w:sz w:val="22"/>
-        </w:rPr>
-        <w:t xml:space="preserve">Question 25: </w:t>
-      </w:r>
-      <w:r>
-        <w:rPr>
-          <w:sz w:val="22"/>
-        </w:rPr>
-        <w:t>Every sentence (S) divides into which two parts?</w:t>
-      </w:r>
-      <w:r>
-        <w:rPr>
-          <w:sz w:val="22"/>
-        </w:rPr>
-        <w:t xml:space="preserve"> (2 pts)</w:t>
-      </w:r>
-    </w:p>
-    <w:p>
-      <w:pPr>
-        <w:spacing w:before="40" w:after="40"/>
-        <w:ind w:left="432"/>
-      </w:pPr>
-      <w:r>
-        <w:rPr>
-          <w:b/>
-          <w:sz w:val="22"/>
-        </w:rPr>
-        <w:t xml:space="preserve">Answer: </w:t>
-      </w:r>
-      <w:r>
-        <w:rPr>
-          <w:b/>
-          <w:sz w:val="22"/>
-        </w:rPr>
-        <w:t>c</w:t>
-      </w:r>
-    </w:p>
-    <w:p>
-      <w:pPr>
-        <w:spacing w:before="20" w:after="20"/>
-        <w:ind w:left="720"/>
-      </w:pPr>
-      <w:r>
-        <w:rPr>
-          <w:sz w:val="22"/>
-        </w:rPr>
-        <w:t>a. Determiner + Sentence</w:t>
-      </w:r>
-    </w:p>
-    <w:p>
-      <w:pPr>
-        <w:spacing w:before="20" w:after="20"/>
-        <w:ind w:left="720"/>
-      </w:pPr>
-      <w:r>
-        <w:rPr>
-          <w:sz w:val="22"/>
-        </w:rPr>
-        <w:t>b. Noun + Verb</w:t>
-      </w:r>
-      <w:r>
-        <w:rPr>
-          <w:i/>
-          <w:sz w:val="20"/>
-        </w:rPr>
-        <w:t xml:space="preserve"> — Too narrow; subjects and predicates are phrases.</w:t>
-      </w:r>
-    </w:p>
-    <w:p>
-      <w:pPr>
-        <w:spacing w:before="20" w:after="20"/>
-        <w:ind w:left="720"/>
-      </w:pPr>
-      <w:r>
-        <w:rPr>
-          <w:b/>
-          <w:sz w:val="22"/>
-        </w:rPr>
-        <w:t>c. Subject NP + Predicate VP</w:t>
-      </w:r>
-      <w:r>
-        <w:rPr>
-          <w:i/>
-          <w:sz w:val="20"/>
-        </w:rPr>
-        <w:t xml:space="preserve"> — Correct. S → NP + VP is the fundamental structure.</w:t>
-      </w:r>
-    </w:p>
-    <w:p>
-      <w:pPr>
-        <w:spacing w:before="20" w:after="20"/>
-        <w:ind w:left="720"/>
-      </w:pPr>
-      <w:r>
-        <w:rPr>
-          <w:sz w:val="22"/>
-        </w:rPr>
-        <w:t>d. Adjective Phrase + Verb Phrase</w:t>
-      </w:r>
-    </w:p>
-    <w:p>
-      <w:r>
-        <w:br w:type="page"/>
-      </w:r>
-    </w:p>
-    <w:p>
-      <w:pPr>
-        <w:pStyle w:val="Heading2"/>
-      </w:pPr>
-      <w:r>
-        <w:rPr>
-          <w:sz w:val="28"/>
-        </w:rPr>
-        <w:t>Section B: Sentence Labeling and Diagramming (50 points)</w:t>
-      </w:r>
-    </w:p>
-    <w:p>
-      <w:r>
-        <w:rPr>
-          <w:b/>
-          <w:sz w:val="22"/>
-        </w:rPr>
-        <w:t xml:space="preserve">Instructions: </w:t>
-      </w:r>
-      <w:r>
-        <w:rPr>
-          <w:sz w:val="22"/>
-        </w:rPr>
-        <w:t>For each sentence below, take two steps.</w:t>
-      </w:r>
-    </w:p>
-    <w:p>
-      <w:r>
-        <w:rPr>
-          <w:b/>
-          <w:sz w:val="22"/>
-        </w:rPr>
-        <w:t xml:space="preserve">1. </w:t>
-      </w:r>
-      <w:r>
-        <w:rPr>
-          <w:b/>
-          <w:sz w:val="22"/>
-        </w:rPr>
-        <w:t xml:space="preserve">Complete the labeling table </w:t>
-      </w:r>
-      <w:r>
-        <w:rPr>
-          <w:sz w:val="22"/>
-        </w:rPr>
-        <w:t>by filling in the Role, Phrase, and Part of Speech (POS) rows.</w:t>
-      </w:r>
-    </w:p>
-    <w:p>
-      <w:r>
-        <w:rPr>
-          <w:b/>
-          <w:sz w:val="22"/>
-        </w:rPr>
-        <w:t xml:space="preserve">2. </w:t>
-      </w:r>
-      <w:r>
-        <w:rPr>
-          <w:b/>
-          <w:sz w:val="22"/>
-        </w:rPr>
-        <w:t xml:space="preserve">Write the bracket notation </w:t>
-      </w:r>
-      <w:r>
-        <w:rPr>
-          <w:sz w:val="22"/>
-        </w:rPr>
-        <w:t>for the sentence's tree diagram.</w:t>
-      </w:r>
-    </w:p>
-    <w:p>
-      <w:r>
-        <w:rPr>
-          <w:b/>
-          <w:sz w:val="20"/>
-        </w:rPr>
-        <w:t>Scoring (per sentence):</w:t>
-      </w:r>
-    </w:p>
-    <w:p>
-      <w:pPr>
-        <w:pStyle w:val="ListBullet"/>
-      </w:pPr>
-      <w:r/>
-      <w:r>
-        <w:rPr>
-          <w:sz w:val="20"/>
-        </w:rPr>
-        <w:t>4 points — Correct Parts of Speech</w:t>
-      </w:r>
-    </w:p>
-    <w:p>
-      <w:pPr>
-        <w:pStyle w:val="ListBullet"/>
-      </w:pPr>
-      <w:r/>
-      <w:r>
-        <w:rPr>
-          <w:sz w:val="20"/>
-        </w:rPr>
-        <w:t>3 points — Correct Phrase labels</w:t>
-      </w:r>
-    </w:p>
-    <w:p>
-      <w:pPr>
-        <w:pStyle w:val="ListBullet"/>
-      </w:pPr>
-      <w:r/>
-      <w:r>
-        <w:rPr>
-          <w:sz w:val="20"/>
-        </w:rPr>
-        <w:t>1 point — Correct Role labels (Subject, Predicate)</w:t>
-      </w:r>
-    </w:p>
-    <w:p>
-      <w:pPr>
-        <w:pStyle w:val="ListBullet"/>
-      </w:pPr>
-      <w:r/>
-      <w:r>
-        <w:rPr>
-          <w:sz w:val="20"/>
-        </w:rPr>
-        <w:t>2 points — Correct bracket notation</w:t>
+        <w:t>2 points — Correct tree diagram</w:t>
       </w:r>
     </w:p>
     <w:p>
@@ -3306,6 +3306,7 @@
               <w:rPr>
                 <w:sz w:val="18"/>
               </w:rPr>
+              <w:t>Adjective Phrase = ADJP</w:t>
             </w:r>
           </w:p>
         </w:tc>
@@ -3348,7 +3349,7 @@
               <w:rPr>
                 <w:sz w:val="18"/>
               </w:rPr>
-              <w:t>Adjective Phrase = ADJP</w:t>
+              <w:t>Adverb Phrase = ADVP</w:t>
             </w:r>
           </w:p>
         </w:tc>
@@ -3391,7 +3392,7 @@
               <w:rPr>
                 <w:sz w:val="18"/>
               </w:rPr>
-              <w:t>Adverb Phrase = ADVP</w:t>
+              <w:t>Prepositional Phrase = PP</w:t>
             </w:r>
           </w:p>
         </w:tc>
@@ -3421,48 +3422,6 @@
                 <w:sz w:val="18"/>
               </w:rPr>
               <w:t>Preposition = PREP</w:t>
-            </w:r>
-          </w:p>
-        </w:tc>
-        <w:tc>
-          <w:tcPr>
-            <w:tcW w:type="dxa" w:w="2880"/>
-          </w:tcPr>
-          <w:p>
-            <w:r/>
-            <w:r>
-              <w:rPr>
-                <w:sz w:val="18"/>
-              </w:rPr>
-              <w:t>Prepositional Phrase = PP</w:t>
-            </w:r>
-          </w:p>
-        </w:tc>
-        <w:tc>
-          <w:tcPr>
-            <w:tcW w:type="dxa" w:w="2880"/>
-          </w:tcPr>
-          <w:p>
-            <w:r/>
-            <w:r>
-              <w:rPr>
-                <w:sz w:val="18"/>
-              </w:rPr>
-            </w:r>
-          </w:p>
-        </w:tc>
-      </w:tr>
-      <w:tr>
-        <w:tc>
-          <w:tcPr>
-            <w:tcW w:type="dxa" w:w="2880"/>
-          </w:tcPr>
-          <w:p>
-            <w:r/>
-            <w:r>
-              <w:rPr>
-                <w:sz w:val="18"/>
-              </w:rPr>
             </w:r>
           </w:p>
         </w:tc>
@@ -4003,7 +3962,7 @@
           <w:i/>
           <w:sz w:val="22"/>
         </w:rPr>
-        <w:t>The cat slept.</w:t>
+        <w:t>The cat slept on her comfy bed.</w:t>
       </w:r>
     </w:p>
     <w:tbl>
@@ -4014,15 +3973,19 @@
         <w:tblLook w:firstColumn="1" w:firstRow="1" w:lastColumn="0" w:lastRow="0" w:noHBand="0" w:noVBand="1" w:val="04A0"/>
       </w:tblPr>
       <w:tblGrid>
-        <w:gridCol w:w="2160"/>
-        <w:gridCol w:w="2160"/>
-        <w:gridCol w:w="2160"/>
-        <w:gridCol w:w="2160"/>
+        <w:gridCol w:w="1080"/>
+        <w:gridCol w:w="1080"/>
+        <w:gridCol w:w="1080"/>
+        <w:gridCol w:w="1080"/>
+        <w:gridCol w:w="1080"/>
+        <w:gridCol w:w="1080"/>
+        <w:gridCol w:w="1080"/>
+        <w:gridCol w:w="1080"/>
       </w:tblGrid>
       <w:tr>
         <w:tc>
           <w:tcPr>
-            <w:tcW w:type="dxa" w:w="2160"/>
+            <w:tcW w:type="dxa" w:w="1080"/>
             <w:shd w:fill="E8E8E8" w:val="clear"/>
           </w:tcPr>
           <w:p>
@@ -4041,7 +4004,7 @@
         </w:tc>
         <w:tc>
           <w:tcPr>
-            <w:tcW w:type="dxa" w:w="4320"/>
+            <w:tcW w:type="dxa" w:w="2160"/>
             <w:gridSpan w:val="2"/>
           </w:tcPr>
           <w:p>
@@ -4059,7 +4022,8 @@
         </w:tc>
         <w:tc>
           <w:tcPr>
-            <w:tcW w:type="dxa" w:w="2160"/>
+            <w:tcW w:type="dxa" w:w="5400"/>
+            <w:gridSpan w:val="5"/>
           </w:tcPr>
           <w:p>
             <w:pPr>
@@ -4078,7 +4042,7 @@
       <w:tr>
         <w:tc>
           <w:tcPr>
-            <w:tcW w:type="dxa" w:w="2160"/>
+            <w:tcW w:type="dxa" w:w="1080"/>
             <w:shd w:fill="E8E8E8" w:val="clear"/>
           </w:tcPr>
           <w:p>
@@ -4097,7 +4061,7 @@
         </w:tc>
         <w:tc>
           <w:tcPr>
-            <w:tcW w:type="dxa" w:w="4320"/>
+            <w:tcW w:type="dxa" w:w="2160"/>
             <w:gridSpan w:val="2"/>
           </w:tcPr>
           <w:p>
@@ -4115,7 +4079,7 @@
         </w:tc>
         <w:tc>
           <w:tcPr>
-            <w:tcW w:type="dxa" w:w="2160"/>
+            <w:tcW w:type="dxa" w:w="1080"/>
           </w:tcPr>
           <w:p>
             <w:pPr>
@@ -4130,11 +4094,29 @@
             </w:r>
           </w:p>
         </w:tc>
+        <w:tc>
+          <w:tcPr>
+            <w:tcW w:type="dxa" w:w="4320"/>
+            <w:gridSpan w:val="4"/>
+          </w:tcPr>
+          <w:p>
+            <w:pPr>
+              <w:jc w:val="center"/>
+            </w:pPr>
+            <w:r/>
+            <w:r>
+              <w:rPr>
+                <w:sz w:val="20"/>
+              </w:rPr>
+              <w:t>PP</w:t>
+            </w:r>
+          </w:p>
+        </w:tc>
       </w:tr>
       <w:tr>
         <w:tc>
           <w:tcPr>
-            <w:tcW w:type="dxa" w:w="2160"/>
+            <w:tcW w:type="dxa" w:w="1080"/>
             <w:shd w:fill="E8E8E8" w:val="clear"/>
           </w:tcPr>
           <w:p>
@@ -4153,7 +4135,7 @@
         </w:tc>
         <w:tc>
           <w:tcPr>
-            <w:tcW w:type="dxa" w:w="2160"/>
+            <w:tcW w:type="dxa" w:w="1080"/>
           </w:tcPr>
           <w:p>
             <w:pPr>
@@ -4170,7 +4152,7 @@
         </w:tc>
         <w:tc>
           <w:tcPr>
-            <w:tcW w:type="dxa" w:w="2160"/>
+            <w:tcW w:type="dxa" w:w="1080"/>
           </w:tcPr>
           <w:p>
             <w:pPr>
@@ -4187,7 +4169,7 @@
         </w:tc>
         <w:tc>
           <w:tcPr>
-            <w:tcW w:type="dxa" w:w="2160"/>
+            <w:tcW w:type="dxa" w:w="1080"/>
           </w:tcPr>
           <w:p>
             <w:pPr>
@@ -4202,11 +4184,79 @@
             </w:r>
           </w:p>
         </w:tc>
+        <w:tc>
+          <w:tcPr>
+            <w:tcW w:type="dxa" w:w="1080"/>
+          </w:tcPr>
+          <w:p>
+            <w:pPr>
+              <w:jc w:val="center"/>
+            </w:pPr>
+            <w:r/>
+            <w:r>
+              <w:rPr>
+                <w:sz w:val="20"/>
+              </w:rPr>
+              <w:t>on</w:t>
+            </w:r>
+          </w:p>
+        </w:tc>
+        <w:tc>
+          <w:tcPr>
+            <w:tcW w:type="dxa" w:w="1080"/>
+          </w:tcPr>
+          <w:p>
+            <w:pPr>
+              <w:jc w:val="center"/>
+            </w:pPr>
+            <w:r/>
+            <w:r>
+              <w:rPr>
+                <w:sz w:val="20"/>
+              </w:rPr>
+              <w:t>her</w:t>
+            </w:r>
+          </w:p>
+        </w:tc>
+        <w:tc>
+          <w:tcPr>
+            <w:tcW w:type="dxa" w:w="1080"/>
+          </w:tcPr>
+          <w:p>
+            <w:pPr>
+              <w:jc w:val="center"/>
+            </w:pPr>
+            <w:r/>
+            <w:r>
+              <w:rPr>
+                <w:sz w:val="20"/>
+              </w:rPr>
+              <w:t>comfy</w:t>
+            </w:r>
+          </w:p>
+        </w:tc>
+        <w:tc>
+          <w:tcPr>
+            <w:tcW w:type="dxa" w:w="1080"/>
+          </w:tcPr>
+          <w:p>
+            <w:pPr>
+              <w:jc w:val="center"/>
+            </w:pPr>
+            <w:r/>
+            <w:r>
+              <w:rPr>
+                <w:sz w:val="20"/>
+              </w:rPr>
+              <w:t>bed</w:t>
+            </w:r>
+          </w:p>
+        </w:tc>
       </w:tr>
       <w:tr>
         <w:tc>
           <w:tcPr>
-            <w:tcW w:type="dxa" w:w="2160"/>
+            <w:tcW w:type="dxa" w:w="1080"/>
             <w:shd w:fill="E8E8E8" w:val="clear"/>
           </w:tcPr>
           <w:p>
@@ -4225,7 +4275,7 @@
         </w:tc>
         <w:tc>
           <w:tcPr>
-            <w:tcW w:type="dxa" w:w="2160"/>
+            <w:tcW w:type="dxa" w:w="1080"/>
           </w:tcPr>
           <w:p>
             <w:pPr>
@@ -4242,7 +4292,7 @@
         </w:tc>
         <w:tc>
           <w:tcPr>
-            <w:tcW w:type="dxa" w:w="2160"/>
+            <w:tcW w:type="dxa" w:w="1080"/>
           </w:tcPr>
           <w:p>
             <w:pPr>
@@ -4259,7 +4309,7 @@
         </w:tc>
         <w:tc>
           <w:tcPr>
-            <w:tcW w:type="dxa" w:w="2160"/>
+            <w:tcW w:type="dxa" w:w="1080"/>
           </w:tcPr>
           <w:p>
             <w:pPr>
@@ -4274,6 +4324,74 @@
             </w:r>
           </w:p>
         </w:tc>
+        <w:tc>
+          <w:tcPr>
+            <w:tcW w:type="dxa" w:w="1080"/>
+          </w:tcPr>
+          <w:p>
+            <w:pPr>
+              <w:jc w:val="center"/>
+            </w:pPr>
+            <w:r/>
+            <w:r>
+              <w:rPr>
+                <w:sz w:val="20"/>
+              </w:rPr>
+              <w:t>PREP</w:t>
+            </w:r>
+          </w:p>
+        </w:tc>
+        <w:tc>
+          <w:tcPr>
+            <w:tcW w:type="dxa" w:w="1080"/>
+          </w:tcPr>
+          <w:p>
+            <w:pPr>
+              <w:jc w:val="center"/>
+            </w:pPr>
+            <w:r/>
+            <w:r>
+              <w:rPr>
+                <w:sz w:val="20"/>
+              </w:rPr>
+              <w:t>DET</w:t>
+            </w:r>
+          </w:p>
+        </w:tc>
+        <w:tc>
+          <w:tcPr>
+            <w:tcW w:type="dxa" w:w="1080"/>
+          </w:tcPr>
+          <w:p>
+            <w:pPr>
+              <w:jc w:val="center"/>
+            </w:pPr>
+            <w:r/>
+            <w:r>
+              <w:rPr>
+                <w:sz w:val="20"/>
+              </w:rPr>
+              <w:t>ADJ</w:t>
+            </w:r>
+          </w:p>
+        </w:tc>
+        <w:tc>
+          <w:tcPr>
+            <w:tcW w:type="dxa" w:w="1080"/>
+          </w:tcPr>
+          <w:p>
+            <w:pPr>
+              <w:jc w:val="center"/>
+            </w:pPr>
+            <w:r/>
+            <w:r>
+              <w:rPr>
+                <w:sz w:val="20"/>
+              </w:rPr>
+              <w:t>N</w:t>
+            </w:r>
+          </w:p>
+        </w:tc>
       </w:tr>
     </w:tbl>
     <w:p>
@@ -4285,14 +4403,14 @@
           <w:b/>
           <w:sz w:val="20"/>
         </w:rPr>
-        <w:t xml:space="preserve">Bracket notation: </w:t>
+        <w:t xml:space="preserve">Bracket notation (instructor reference): </w:t>
       </w:r>
       <w:r>
         <w:rPr>
           <w:rFonts w:ascii="Consolas" w:hAnsi="Consolas"/>
           <w:sz w:val="18"/>
         </w:rPr>
-        <w:t>[S [NP [DET The] [N cat]] [VP [V slept]]]</w:t>
+        <w:t>[S [NP [DET The] [N cat]] [VP [V slept] [PP [PREP on] [NP [DET her] [ADJP [ADJ comfy]] [N bed]]]]]</w:t>
       </w:r>
     </w:p>
     <w:p>
@@ -4303,7 +4421,7 @@
       <w:r>
         <w:drawing>
           <wp:inline xmlns:a="http://schemas.openxmlformats.org/drawingml/2006/main" xmlns:pic="http://schemas.openxmlformats.org/drawingml/2006/picture">
-            <wp:extent cx="3200400" cy="2921295"/>
+            <wp:extent cx="4572000" cy="3111124"/>
             <wp:docPr id="2" name="Picture 2"/>
             <wp:cNvGraphicFramePr>
               <a:graphicFrameLocks noChangeAspect="1"/>
@@ -4324,7 +4442,7 @@
                   <pic:spPr>
                     <a:xfrm>
                       <a:off x="0" y="0"/>
-                      <a:ext cx="3200400" cy="2921295"/>
+                      <a:ext cx="4572000" cy="3111124"/>
                     </a:xfrm>
                     <a:prstGeom prst="rect"/>
                   </pic:spPr>
@@ -4855,7 +4973,7 @@
           <w:b/>
           <w:sz w:val="20"/>
         </w:rPr>
-        <w:t xml:space="preserve">Bracket notation: </w:t>
+        <w:t xml:space="preserve">Bracket notation (instructor reference): </w:t>
       </w:r>
       <w:r>
         <w:rPr>
@@ -5355,7 +5473,7 @@
           <w:b/>
           <w:sz w:val="20"/>
         </w:rPr>
-        <w:t xml:space="preserve">Bracket notation: </w:t>
+        <w:t xml:space="preserve">Bracket notation (instructor reference): </w:t>
       </w:r>
       <w:r>
         <w:rPr>
@@ -5960,7 +6078,7 @@
           <w:b/>
           <w:sz w:val="20"/>
         </w:rPr>
-        <w:t xml:space="preserve">Bracket notation: </w:t>
+        <w:t xml:space="preserve">Bracket notation (instructor reference): </w:t>
       </w:r>
       <w:r>
         <w:rPr>
@@ -6566,7 +6684,7 @@
           <w:b/>
           <w:sz w:val="20"/>
         </w:rPr>
-        <w:t xml:space="preserve">Bracket notation: </w:t>
+        <w:t xml:space="preserve">Bracket notation (instructor reference): </w:t>
       </w:r>
       <w:r>
         <w:rPr>
@@ -6656,7 +6774,7 @@
         <w:rPr>
           <w:sz w:val="22"/>
         </w:rPr>
-        <w:t>Write a sentence containing a compound word (a word formed from two free morphemes). Underline or circle the compound word. (2 pts)</w:t>
+        <w:t>Write a sentence containing a compound word (a word formed from two free morphemes). Underline or circle the compound word and identify its two free morphemes. (2 pts)</w:t>
       </w:r>
     </w:p>
     <w:p>
@@ -6675,7 +6793,7 @@
           <w:i/>
           <w:sz w:val="20"/>
         </w:rPr>
-        <w:t>I placed the flowers on the bookshelf.</w:t>
+        <w:t>I placed the flowers on the bookshelf.  Free morphemes: book + shelf</w:t>
       </w:r>
     </w:p>
     <w:p>
@@ -6686,7 +6804,7 @@
         <w:rPr>
           <w:sz w:val="20"/>
         </w:rPr>
-        <w:t>Award 1 pt for a valid sentence and 1 pt for correctly identifying a compound word (book + shelf).</w:t>
+        <w:t>Award 1 pt for a valid sentence with the compound word identified, and 1 pt for correctly naming both free morphemes.</w:t>
       </w:r>
     </w:p>
     <w:p>
@@ -6704,7 +6822,7 @@
         <w:rPr>
           <w:sz w:val="22"/>
         </w:rPr>
-        <w:t>Write a sentence containing a prepositional phrase that modifies a noun. Underline or circle the prepositional phrase. (2 pts)</w:t>
+        <w:t>Write a sentence containing a prepositional phrase that modifies the verb phrase (not a noun). Underline or circle the prepositional phrase. (2 pts)</w:t>
       </w:r>
     </w:p>
     <w:p>
@@ -6723,7 +6841,7 @@
           <w:i/>
           <w:sz w:val="20"/>
         </w:rPr>
-        <w:t>The student from Colorado passed the exam.</w:t>
+        <w:t>She ran in the park.  (The PP “in the park” modifies the verb “ran,” telling us where the action happened.)</w:t>
       </w:r>
     </w:p>
     <w:p>
@@ -6734,7 +6852,7 @@
         <w:rPr>
           <w:sz w:val="20"/>
         </w:rPr>
-        <w:t>Award 1 pt for a valid sentence and 1 pt for correctly identifying a PP that modifies a noun (not a verb).</w:t>
+        <w:t>Award 1 pt for a valid sentence and 1 pt for correctly identifying a PP that modifies the VP (not a noun).</w:t>
       </w:r>
     </w:p>
     <w:p>
@@ -6782,7 +6900,7 @@
         <w:rPr>
           <w:sz w:val="20"/>
         </w:rPr>
-        <w:t>Award 1 pt for a valid word with 3+ morphemes and 1 pt for correct labeling.</w:t>
+        <w:t>Award 1 pt for a valid word with 3+ morphemes and 1 pt for correct labeling of each morpheme.</w:t>
       </w:r>
     </w:p>
     <w:p>
@@ -6848,7 +6966,7 @@
         <w:rPr>
           <w:sz w:val="22"/>
         </w:rPr>
-        <w:t>Write a sentence that is structurally ambiguous (has two possible meanings due to different possible structures). Briefly explain the two meanings. (2 pts)</w:t>
+        <w:t>Write a sentence in which an adverb modifies an adjective (not a verb). Underline or circle the adverb and identify the adjective it modifies. (2 pts)</w:t>
       </w:r>
     </w:p>
     <w:p>
@@ -6867,11 +6985,7 @@
           <w:i/>
           <w:sz w:val="20"/>
         </w:rPr>
-        <w:t>"I saw the man with binoculars."</w:t>
-        <w:br/>
-        <w:t>Meaning 1: I used binoculars to see the man. (PP modifies VP)</w:t>
-        <w:br/>
-        <w:t>Meaning 2: I saw the man who had binoculars. (PP modifies NP)</w:t>
+        <w:t>"The incredibly fast runner won the race."  (incredibly modifies the adjective fast)</w:t>
       </w:r>
     </w:p>
     <w:p>
@@ -6882,7 +6996,7 @@
         <w:rPr>
           <w:sz w:val="20"/>
         </w:rPr>
-        <w:t>Award 1 pt for a genuinely ambiguous sentence and 1 pt for correctly explaining both structural readings.</w:t>
+        <w:t>Award 1 pt for a sentence where an adverb modifies an adjective and 1 pt for correctly identifying both the adverb and the adjective.</w:t>
       </w:r>
     </w:p>
     <w:p>
@@ -7167,7 +7281,7 @@
                 <w:b/>
                 <w:sz w:val="20"/>
               </w:rPr>
-              <w:t>c</w:t>
+              <w:t>b</w:t>
             </w:r>
           </w:p>
         </w:tc>
@@ -7527,7 +7641,7 @@
                 <w:b/>
                 <w:sz w:val="20"/>
               </w:rPr>
-              <w:t>b</w:t>
+              <w:t>c</w:t>
             </w:r>
           </w:p>
         </w:tc>
@@ -7778,7 +7892,7 @@
                 <w:b/>
                 <w:sz w:val="20"/>
               </w:rPr>
-              <w:t>b</w:t>
+              <w:t>c</w:t>
             </w:r>
           </w:p>
         </w:tc>
@@ -7850,7 +7964,7 @@
                 <w:b/>
                 <w:sz w:val="20"/>
               </w:rPr>
-              <w:t>c</w:t>
+              <w:t>d</w:t>
             </w:r>
           </w:p>
         </w:tc>

</xml_diff>

<commit_message>
Restructure Section A: shrink morphology to 6 Qs, expand word classes to 10
A1 (Q1-6, 12 pts): pure morphology only
A2 (Q7-16, 20 pts): gradeability + S→NP+VP lead the section, followed by
  the original open/closed class questions (Q9-16 unchanged)
A3 (Q17-25, 18 pts): unchanged

Co-Authored-By: Claude Sonnet 4.6 <noreply@anthropic.com>
</commit_message>
<xml_diff>
--- a/Homework/Exams/ENGL 3110 - S26 - Exam One - Answer Key.docx
+++ b/Homework/Exams/ENGL 3110 - S26 - Exam One - Answer Key.docx
@@ -108,7 +108,7 @@
         <w:rPr>
           <w:sz w:val="24"/>
         </w:rPr>
-        <w:t>Section A1: Morphology and Word Structure (Questions 1–8, 16 points)</w:t>
+        <w:t>Section A1: Morphology and Word Structure (Questions 1–6, 12 points)</w:t>
       </w:r>
     </w:p>
     <w:p>
@@ -347,7 +347,7 @@
         <w:rPr>
           <w:sz w:val="22"/>
         </w:rPr>
-        <w:t>Which test reliably distinguishes adjectives from determiners?</w:t>
+        <w:t>The suffix -tion typically creates which word class?</w:t>
       </w:r>
       <w:r>
         <w:rPr>
@@ -373,7 +373,7 @@
           <w:b/>
           <w:sz w:val="22"/>
         </w:rPr>
-        <w:t>b</w:t>
+        <w:t>c</w:t>
       </w:r>
     </w:p>
     <w:p>
@@ -385,14 +385,39 @@
         <w:rPr>
           <w:sz w:val="22"/>
         </w:rPr>
-        <w:t>a. Adjectives can be pluralized</w:t>
+        <w:t>a. Verb</w:t>
+      </w:r>
+    </w:p>
+    <w:p>
+      <w:pPr>
+        <w:spacing w:before="20" w:after="20"/>
+        <w:ind w:left="720"/>
+      </w:pPr>
+      <w:r>
+        <w:rPr>
+          <w:sz w:val="22"/>
+        </w:rPr>
+        <w:t>b. Adjective</w:t>
+      </w:r>
+    </w:p>
+    <w:p>
+      <w:pPr>
+        <w:spacing w:before="20" w:after="20"/>
+        <w:ind w:left="720"/>
+      </w:pPr>
+      <w:r>
+        <w:rPr>
+          <w:b/>
+          <w:sz w:val="22"/>
+        </w:rPr>
+        <w:t>c. Noun</w:t>
       </w:r>
       <w:r>
         <w:rPr>
           <w:i/>
           <w:sz w:val="20"/>
         </w:rPr>
-        <w:t xml:space="preserve"> — Incorrect. Nouns are pluralized, not adjectives.</w:t>
+        <w:t xml:space="preserve"> — -tion converts verbs into nouns: action, creation, decision</w:t>
       </w:r>
     </w:p>
     <w:p>
@@ -402,17 +427,72 @@
       </w:pPr>
       <w:r>
         <w:rPr>
+          <w:sz w:val="22"/>
+        </w:rPr>
+        <w:t>d. Adverb</w:t>
+      </w:r>
+    </w:p>
+    <w:p>
+      <w:pPr>
+        <w:spacing w:before="120" w:after="40"/>
+      </w:pPr>
+      <w:r>
+        <w:rPr>
           <w:b/>
           <w:sz w:val="22"/>
         </w:rPr>
-        <w:t>b. Adjectives can be “gradeable” — they have comparative and superlative forms (e.g., taller/tallest or more challenging/most challenging)</w:t>
+        <w:t xml:space="preserve">Question 4: </w:t>
+      </w:r>
+      <w:r>
+        <w:rPr>
+          <w:sz w:val="22"/>
+        </w:rPr>
+        <w:t>Which word is an example of a compound (formed from two free morphemes)?</w:t>
+      </w:r>
+      <w:r>
+        <w:rPr>
+          <w:sz w:val="22"/>
+        </w:rPr>
+        <w:t xml:space="preserve"> (2 pts)</w:t>
+      </w:r>
+    </w:p>
+    <w:p>
+      <w:pPr>
+        <w:spacing w:before="40" w:after="40"/>
+        <w:ind w:left="432"/>
+      </w:pPr>
+      <w:r>
+        <w:rPr>
+          <w:b/>
+          <w:sz w:val="22"/>
+        </w:rPr>
+        <w:t xml:space="preserve">Answer: </w:t>
+      </w:r>
+      <w:r>
+        <w:rPr>
+          <w:b/>
+          <w:sz w:val="22"/>
+        </w:rPr>
+        <w:t>c</w:t>
+      </w:r>
+    </w:p>
+    <w:p>
+      <w:pPr>
+        <w:spacing w:before="20" w:after="20"/>
+        <w:ind w:left="720"/>
+      </w:pPr>
+      <w:r>
+        <w:rPr>
+          <w:sz w:val="22"/>
+        </w:rPr>
+        <w:t>a. understand</w:t>
       </w:r>
       <w:r>
         <w:rPr>
           <w:i/>
           <w:sz w:val="20"/>
         </w:rPr>
-        <w:t xml:space="preserve"> — Correct. Determiners do not have comparative or superlative forms: you cannot say "taller the" or "more the."</w:t>
+        <w:t xml:space="preserve"> — 1 morpheme. The meaning does not derive from "under" + "stand."</w:t>
       </w:r>
     </w:p>
     <w:p>
@@ -424,14 +504,14 @@
         <w:rPr>
           <w:sz w:val="22"/>
         </w:rPr>
-        <w:t>c. Adjectives always appear after the noun</w:t>
+        <w:t>b. carpet</w:t>
       </w:r>
       <w:r>
         <w:rPr>
           <w:i/>
           <w:sz w:val="20"/>
         </w:rPr>
-        <w:t xml:space="preserve"> — Incorrect. Adjectives typically appear before the noun in attributive position.</w:t>
+        <w:t xml:space="preserve"> — 1 morpheme. "Car" + "pet" is coincidental resemblance.</w:t>
       </w:r>
     </w:p>
     <w:p>
@@ -441,20 +521,40 @@
       </w:pPr>
       <w:r>
         <w:rPr>
+          <w:b/>
           <w:sz w:val="22"/>
         </w:rPr>
-        <w:t>d. Adjectives cannot appear before nouns</w:t>
+        <w:t>c. bookcase</w:t>
       </w:r>
       <w:r>
         <w:rPr>
           <w:i/>
           <w:sz w:val="20"/>
         </w:rPr>
-        <w:t xml:space="preserve"> — Incorrect. Adjectives routinely appear before nouns (the tall man).</w:t>
+        <w:t xml:space="preserve"> — 2 free morphemes: book + case. The meaning is compositional.</w:t>
       </w:r>
     </w:p>
     <w:p>
       <w:pPr>
+        <w:spacing w:before="20" w:after="20"/>
+        <w:ind w:left="720"/>
+      </w:pPr>
+      <w:r>
+        <w:rPr>
+          <w:sz w:val="22"/>
+        </w:rPr>
+        <w:t>d. receive</w:t>
+      </w:r>
+      <w:r>
+        <w:rPr>
+          <w:i/>
+          <w:sz w:val="20"/>
+        </w:rPr>
+        <w:t xml:space="preserve"> — 1 morpheme. "Ceive" is not a word in modern English.</w:t>
+      </w:r>
+    </w:p>
+    <w:p>
+      <w:pPr>
         <w:spacing w:before="120" w:after="40"/>
       </w:pPr>
       <w:r>
@@ -462,13 +562,13 @@
           <w:b/>
           <w:sz w:val="22"/>
         </w:rPr>
-        <w:t xml:space="preserve">Question 4: </w:t>
+        <w:t xml:space="preserve">Question 5: </w:t>
       </w:r>
       <w:r>
         <w:rPr>
           <w:sz w:val="22"/>
         </w:rPr>
-        <w:t>The suffix -tion typically creates which word class?</w:t>
+        <w:t>The word "unhelpful" contains how many morphemes?</w:t>
       </w:r>
       <w:r>
         <w:rPr>
@@ -506,7 +606,7 @@
         <w:rPr>
           <w:sz w:val="22"/>
         </w:rPr>
-        <w:t>a. Verb</w:t>
+        <w:t>a. 1</w:t>
       </w:r>
     </w:p>
     <w:p>
@@ -518,7 +618,7 @@
         <w:rPr>
           <w:sz w:val="22"/>
         </w:rPr>
-        <w:t>b. Adjective</w:t>
+        <w:t>b. 2</w:t>
       </w:r>
     </w:p>
     <w:p>
@@ -531,14 +631,14 @@
           <w:b/>
           <w:sz w:val="22"/>
         </w:rPr>
-        <w:t>c. Noun</w:t>
+        <w:t>c. 3</w:t>
       </w:r>
       <w:r>
         <w:rPr>
           <w:i/>
           <w:sz w:val="20"/>
         </w:rPr>
-        <w:t xml:space="preserve"> — -tion converts verbs into nouns: action, creation, decision</w:t>
+        <w:t xml:space="preserve"> — un- (bound) + help (free) + -ful (bound)</w:t>
       </w:r>
     </w:p>
     <w:p>
@@ -550,7 +650,7 @@
         <w:rPr>
           <w:sz w:val="22"/>
         </w:rPr>
-        <w:t>d. Adverb</w:t>
+        <w:t>d. 4</w:t>
       </w:r>
     </w:p>
     <w:p>
@@ -562,13 +662,13 @@
           <w:b/>
           <w:sz w:val="22"/>
         </w:rPr>
-        <w:t xml:space="preserve">Question 5: </w:t>
+        <w:t xml:space="preserve">Question 6: </w:t>
       </w:r>
       <w:r>
         <w:rPr>
           <w:sz w:val="22"/>
         </w:rPr>
-        <w:t>Which word is an example of a compound (formed from two free morphemes)?</w:t>
+        <w:t>Which of the following correctly identifies the morphemes in "rebuilding"?</w:t>
       </w:r>
       <w:r>
         <w:rPr>
@@ -594,7 +694,7 @@
           <w:b/>
           <w:sz w:val="22"/>
         </w:rPr>
-        <w:t>c</w:t>
+        <w:t>a</w:t>
       </w:r>
     </w:p>
     <w:p>
@@ -604,16 +704,17 @@
       </w:pPr>
       <w:r>
         <w:rPr>
+          <w:b/>
           <w:sz w:val="22"/>
         </w:rPr>
-        <w:t>a. understand</w:t>
+        <w:t>a. re- (bound) + build (free) + -ing (bound)</w:t>
       </w:r>
       <w:r>
         <w:rPr>
           <w:i/>
           <w:sz w:val="20"/>
         </w:rPr>
-        <w:t xml:space="preserve"> — 1 morpheme. The meaning does not derive from "under" + "stand."</w:t>
+        <w:t xml:space="preserve"> — Correct. re- is a bound prefix meaning "again," build is the free base, -ing is bound.</w:t>
       </w:r>
     </w:p>
     <w:p>
@@ -625,14 +726,14 @@
         <w:rPr>
           <w:sz w:val="22"/>
         </w:rPr>
-        <w:t>b. carpet</w:t>
+        <w:t>b. re- (free) + build (free) + -ing (bound)</w:t>
       </w:r>
       <w:r>
         <w:rPr>
           <w:i/>
           <w:sz w:val="20"/>
         </w:rPr>
-        <w:t xml:space="preserve"> — 1 morpheme. "Car" + "pet" is coincidental resemblance.</w:t>
+        <w:t xml:space="preserve"> — Incorrect. re- is bound, not free.</w:t>
       </w:r>
     </w:p>
     <w:p>
@@ -642,17 +743,109 @@
       </w:pPr>
       <w:r>
         <w:rPr>
+          <w:sz w:val="22"/>
+        </w:rPr>
+        <w:t>c. rebuild (free) + -ing (bound)</w:t>
+      </w:r>
+      <w:r>
+        <w:rPr>
+          <w:i/>
+          <w:sz w:val="20"/>
+        </w:rPr>
+        <w:t xml:space="preserve"> — Incorrect. rebuild can be further divided.</w:t>
+      </w:r>
+    </w:p>
+    <w:p>
+      <w:pPr>
+        <w:spacing w:before="20" w:after="20"/>
+        <w:ind w:left="720"/>
+      </w:pPr>
+      <w:r>
+        <w:rPr>
+          <w:sz w:val="22"/>
+        </w:rPr>
+        <w:t>d. re- (bound) + building (free)</w:t>
+      </w:r>
+      <w:r>
+        <w:rPr>
+          <w:i/>
+          <w:sz w:val="20"/>
+        </w:rPr>
+        <w:t xml:space="preserve"> — Incorrect. building should be divided into build + -ing.</w:t>
+      </w:r>
+    </w:p>
+    <w:p>
+      <w:pPr>
+        <w:pStyle w:val="Heading3"/>
+      </w:pPr>
+      <w:r>
+        <w:rPr>
+          <w:sz w:val="24"/>
+        </w:rPr>
+        <w:t>Section A2: Open and Closed Classes (Questions 7–16, 20 points)</w:t>
+      </w:r>
+    </w:p>
+    <w:p>
+      <w:pPr>
+        <w:spacing w:before="120" w:after="40"/>
+      </w:pPr>
+      <w:r>
+        <w:rPr>
           <w:b/>
           <w:sz w:val="22"/>
         </w:rPr>
-        <w:t>c. bookcase</w:t>
+        <w:t xml:space="preserve">Question 7: </w:t>
+      </w:r>
+      <w:r>
+        <w:rPr>
+          <w:sz w:val="22"/>
+        </w:rPr>
+        <w:t>Which test reliably distinguishes adjectives from determiners?</w:t>
+      </w:r>
+      <w:r>
+        <w:rPr>
+          <w:sz w:val="22"/>
+        </w:rPr>
+        <w:t xml:space="preserve"> (2 pts)</w:t>
+      </w:r>
+    </w:p>
+    <w:p>
+      <w:pPr>
+        <w:spacing w:before="40" w:after="40"/>
+        <w:ind w:left="432"/>
+      </w:pPr>
+      <w:r>
+        <w:rPr>
+          <w:b/>
+          <w:sz w:val="22"/>
+        </w:rPr>
+        <w:t xml:space="preserve">Answer: </w:t>
+      </w:r>
+      <w:r>
+        <w:rPr>
+          <w:b/>
+          <w:sz w:val="22"/>
+        </w:rPr>
+        <w:t>b</w:t>
+      </w:r>
+    </w:p>
+    <w:p>
+      <w:pPr>
+        <w:spacing w:before="20" w:after="20"/>
+        <w:ind w:left="720"/>
+      </w:pPr>
+      <w:r>
+        <w:rPr>
+          <w:sz w:val="22"/>
+        </w:rPr>
+        <w:t>a. Adjectives can be pluralized</w:t>
       </w:r>
       <w:r>
         <w:rPr>
           <w:i/>
           <w:sz w:val="20"/>
         </w:rPr>
-        <w:t xml:space="preserve"> — 2 free morphemes: book + case. The meaning is compositional.</w:t>
+        <w:t xml:space="preserve"> — Incorrect. Nouns are pluralized, not adjectives.</w:t>
       </w:r>
     </w:p>
     <w:p>
@@ -662,20 +855,59 @@
       </w:pPr>
       <w:r>
         <w:rPr>
+          <w:b/>
           <w:sz w:val="22"/>
         </w:rPr>
-        <w:t>d. receive</w:t>
+        <w:t>b. Adjectives can be “gradeable” — they have comparative and superlative forms (e.g., taller/tallest or more challenging/most challenging)</w:t>
       </w:r>
       <w:r>
         <w:rPr>
           <w:i/>
           <w:sz w:val="20"/>
         </w:rPr>
-        <w:t xml:space="preserve"> — 1 morpheme. "Ceive" is not a word in modern English.</w:t>
+        <w:t xml:space="preserve"> — Correct. Determiners do not have comparative or superlative forms: you cannot say "taller the" or "more the."</w:t>
       </w:r>
     </w:p>
     <w:p>
       <w:pPr>
+        <w:spacing w:before="20" w:after="20"/>
+        <w:ind w:left="720"/>
+      </w:pPr>
+      <w:r>
+        <w:rPr>
+          <w:sz w:val="22"/>
+        </w:rPr>
+        <w:t>c. Adjectives always appear after the noun</w:t>
+      </w:r>
+      <w:r>
+        <w:rPr>
+          <w:i/>
+          <w:sz w:val="20"/>
+        </w:rPr>
+        <w:t xml:space="preserve"> — Incorrect. Adjectives typically appear before the noun in attributive position.</w:t>
+      </w:r>
+    </w:p>
+    <w:p>
+      <w:pPr>
+        <w:spacing w:before="20" w:after="20"/>
+        <w:ind w:left="720"/>
+      </w:pPr>
+      <w:r>
+        <w:rPr>
+          <w:sz w:val="22"/>
+        </w:rPr>
+        <w:t>d. Adjectives cannot appear before nouns</w:t>
+      </w:r>
+      <w:r>
+        <w:rPr>
+          <w:i/>
+          <w:sz w:val="20"/>
+        </w:rPr>
+        <w:t xml:space="preserve"> — Incorrect. Adjectives routinely appear before nouns (the tall man).</w:t>
+      </w:r>
+    </w:p>
+    <w:p>
+      <w:pPr>
         <w:spacing w:before="120" w:after="40"/>
       </w:pPr>
       <w:r>
@@ -683,13 +915,13 @@
           <w:b/>
           <w:sz w:val="22"/>
         </w:rPr>
-        <w:t xml:space="preserve">Question 6: </w:t>
+        <w:t xml:space="preserve">Question 8: </w:t>
       </w:r>
       <w:r>
         <w:rPr>
           <w:sz w:val="22"/>
         </w:rPr>
-        <w:t>The word "unhelpful" contains how many morphemes?</w:t>
+        <w:t>According to the basic structure of English sentences, every sentence (S) divides into which two parts?</w:t>
       </w:r>
       <w:r>
         <w:rPr>
@@ -727,7 +959,7 @@
         <w:rPr>
           <w:sz w:val="22"/>
         </w:rPr>
-        <w:t>a. 1</w:t>
+        <w:t>a. Determiner + Sentence</w:t>
       </w:r>
     </w:p>
     <w:p>
@@ -739,7 +971,14 @@
         <w:rPr>
           <w:sz w:val="22"/>
         </w:rPr>
-        <w:t>b. 2</w:t>
+        <w:t>b. Noun + Verb</w:t>
+      </w:r>
+      <w:r>
+        <w:rPr>
+          <w:i/>
+          <w:sz w:val="20"/>
+        </w:rPr>
+        <w:t xml:space="preserve"> — Too narrow; subjects and predicates are phrases, not just single words.</w:t>
       </w:r>
     </w:p>
     <w:p>
@@ -752,14 +991,14 @@
           <w:b/>
           <w:sz w:val="22"/>
         </w:rPr>
-        <w:t>c. 3</w:t>
+        <w:t>c. Subject NP + Predicate VP</w:t>
       </w:r>
       <w:r>
         <w:rPr>
           <w:i/>
           <w:sz w:val="20"/>
         </w:rPr>
-        <w:t xml:space="preserve"> — un- (bound) + help (free) + -ful (bound)</w:t>
+        <w:t xml:space="preserve"> — Correct. S → NP + VP is the fundamental structure of every English sentence.</w:t>
       </w:r>
     </w:p>
     <w:p>
@@ -771,246 +1010,7 @@
         <w:rPr>
           <w:sz w:val="22"/>
         </w:rPr>
-        <w:t>d. 4</w:t>
-      </w:r>
-    </w:p>
-    <w:p>
-      <w:pPr>
-        <w:spacing w:before="120" w:after="40"/>
-      </w:pPr>
-      <w:r>
-        <w:rPr>
-          <w:b/>
-          <w:sz w:val="22"/>
-        </w:rPr>
-        <w:t xml:space="preserve">Question 7: </w:t>
-      </w:r>
-      <w:r>
-        <w:rPr>
-          <w:sz w:val="22"/>
-        </w:rPr>
-        <w:t>Which of the following correctly identifies the morphemes in "rebuilding"?</w:t>
-      </w:r>
-      <w:r>
-        <w:rPr>
-          <w:sz w:val="22"/>
-        </w:rPr>
-        <w:t xml:space="preserve"> (2 pts)</w:t>
-      </w:r>
-    </w:p>
-    <w:p>
-      <w:pPr>
-        <w:spacing w:before="40" w:after="40"/>
-        <w:ind w:left="432"/>
-      </w:pPr>
-      <w:r>
-        <w:rPr>
-          <w:b/>
-          <w:sz w:val="22"/>
-        </w:rPr>
-        <w:t xml:space="preserve">Answer: </w:t>
-      </w:r>
-      <w:r>
-        <w:rPr>
-          <w:b/>
-          <w:sz w:val="22"/>
-        </w:rPr>
-        <w:t>a</w:t>
-      </w:r>
-    </w:p>
-    <w:p>
-      <w:pPr>
-        <w:spacing w:before="20" w:after="20"/>
-        <w:ind w:left="720"/>
-      </w:pPr>
-      <w:r>
-        <w:rPr>
-          <w:b/>
-          <w:sz w:val="22"/>
-        </w:rPr>
-        <w:t>a. re- (bound) + build (free) + -ing (bound)</w:t>
-      </w:r>
-      <w:r>
-        <w:rPr>
-          <w:i/>
-          <w:sz w:val="20"/>
-        </w:rPr>
-        <w:t xml:space="preserve"> — Correct. re- is a bound prefix meaning "again," build is the free base, -ing is bound.</w:t>
-      </w:r>
-    </w:p>
-    <w:p>
-      <w:pPr>
-        <w:spacing w:before="20" w:after="20"/>
-        <w:ind w:left="720"/>
-      </w:pPr>
-      <w:r>
-        <w:rPr>
-          <w:sz w:val="22"/>
-        </w:rPr>
-        <w:t>b. re- (free) + build (free) + -ing (bound)</w:t>
-      </w:r>
-      <w:r>
-        <w:rPr>
-          <w:i/>
-          <w:sz w:val="20"/>
-        </w:rPr>
-        <w:t xml:space="preserve"> — Incorrect. re- is bound, not free.</w:t>
-      </w:r>
-    </w:p>
-    <w:p>
-      <w:pPr>
-        <w:spacing w:before="20" w:after="20"/>
-        <w:ind w:left="720"/>
-      </w:pPr>
-      <w:r>
-        <w:rPr>
-          <w:sz w:val="22"/>
-        </w:rPr>
-        <w:t>c. rebuild (free) + -ing (bound)</w:t>
-      </w:r>
-      <w:r>
-        <w:rPr>
-          <w:i/>
-          <w:sz w:val="20"/>
-        </w:rPr>
-        <w:t xml:space="preserve"> — Incorrect. rebuild can be further divided.</w:t>
-      </w:r>
-    </w:p>
-    <w:p>
-      <w:pPr>
-        <w:spacing w:before="20" w:after="20"/>
-        <w:ind w:left="720"/>
-      </w:pPr>
-      <w:r>
-        <w:rPr>
-          <w:sz w:val="22"/>
-        </w:rPr>
-        <w:t>d. re- (bound) + building (free)</w:t>
-      </w:r>
-      <w:r>
-        <w:rPr>
-          <w:i/>
-          <w:sz w:val="20"/>
-        </w:rPr>
-        <w:t xml:space="preserve"> — Incorrect. building should be divided into build + -ing.</w:t>
-      </w:r>
-    </w:p>
-    <w:p>
-      <w:pPr>
-        <w:spacing w:before="120" w:after="40"/>
-      </w:pPr>
-      <w:r>
-        <w:rPr>
-          <w:b/>
-          <w:sz w:val="22"/>
-        </w:rPr>
-        <w:t xml:space="preserve">Question 8: </w:t>
-      </w:r>
-      <w:r>
-        <w:rPr>
-          <w:sz w:val="22"/>
-        </w:rPr>
-        <w:t>According to the basic structure of English sentences, every sentence (S) divides into which two parts?</w:t>
-      </w:r>
-      <w:r>
-        <w:rPr>
-          <w:sz w:val="22"/>
-        </w:rPr>
-        <w:t xml:space="preserve"> (2 pts)</w:t>
-      </w:r>
-    </w:p>
-    <w:p>
-      <w:pPr>
-        <w:spacing w:before="40" w:after="40"/>
-        <w:ind w:left="432"/>
-      </w:pPr>
-      <w:r>
-        <w:rPr>
-          <w:b/>
-          <w:sz w:val="22"/>
-        </w:rPr>
-        <w:t xml:space="preserve">Answer: </w:t>
-      </w:r>
-      <w:r>
-        <w:rPr>
-          <w:b/>
-          <w:sz w:val="22"/>
-        </w:rPr>
-        <w:t>c</w:t>
-      </w:r>
-    </w:p>
-    <w:p>
-      <w:pPr>
-        <w:spacing w:before="20" w:after="20"/>
-        <w:ind w:left="720"/>
-      </w:pPr>
-      <w:r>
-        <w:rPr>
-          <w:sz w:val="22"/>
-        </w:rPr>
-        <w:t>a. Determiner + Sentence</w:t>
-      </w:r>
-    </w:p>
-    <w:p>
-      <w:pPr>
-        <w:spacing w:before="20" w:after="20"/>
-        <w:ind w:left="720"/>
-      </w:pPr>
-      <w:r>
-        <w:rPr>
-          <w:sz w:val="22"/>
-        </w:rPr>
-        <w:t>b. Noun + Verb</w:t>
-      </w:r>
-      <w:r>
-        <w:rPr>
-          <w:i/>
-          <w:sz w:val="20"/>
-        </w:rPr>
-        <w:t xml:space="preserve"> — Too narrow; subjects and predicates are phrases, not just single words.</w:t>
-      </w:r>
-    </w:p>
-    <w:p>
-      <w:pPr>
-        <w:spacing w:before="20" w:after="20"/>
-        <w:ind w:left="720"/>
-      </w:pPr>
-      <w:r>
-        <w:rPr>
-          <w:b/>
-          <w:sz w:val="22"/>
-        </w:rPr>
-        <w:t>c. Subject NP + Predicate VP</w:t>
-      </w:r>
-      <w:r>
-        <w:rPr>
-          <w:i/>
-          <w:sz w:val="20"/>
-        </w:rPr>
-        <w:t xml:space="preserve"> — Correct. S → NP + VP is the fundamental structure of every English sentence.</w:t>
-      </w:r>
-    </w:p>
-    <w:p>
-      <w:pPr>
-        <w:spacing w:before="20" w:after="20"/>
-        <w:ind w:left="720"/>
-      </w:pPr>
-      <w:r>
-        <w:rPr>
-          <w:sz w:val="22"/>
-        </w:rPr>
         <w:t>d. Adjective Phrase + Verb Phrase</w:t>
-      </w:r>
-    </w:p>
-    <w:p>
-      <w:pPr>
-        <w:pStyle w:val="Heading3"/>
-      </w:pPr>
-      <w:r>
-        <w:rPr>
-          <w:sz w:val="24"/>
-        </w:rPr>
-        <w:t>Section A2: Open and Closed Classes (Questions 9–16, 16 points)</w:t>
       </w:r>
     </w:p>
     <w:p>
@@ -7281,7 +7281,7 @@
                 <w:b/>
                 <w:sz w:val="20"/>
               </w:rPr>
-              <w:t>b</w:t>
+              <w:t>c</w:t>
             </w:r>
           </w:p>
         </w:tc>
@@ -7497,7 +7497,7 @@
                 <w:b/>
                 <w:sz w:val="20"/>
               </w:rPr>
-              <w:t>c</w:t>
+              <w:t>a</w:t>
             </w:r>
           </w:p>
         </w:tc>
@@ -7569,7 +7569,7 @@
                 <w:b/>
                 <w:sz w:val="20"/>
               </w:rPr>
-              <w:t>a</w:t>
+              <w:t>b</w:t>
             </w:r>
           </w:p>
         </w:tc>

</xml_diff>

<commit_message>
Update Q24: use 'the school for wizards' as cleaner nested PP example
'for wizards' modifies 'school' (object of outer PP 'from the school for wizards')

Co-Authored-By: Claude Sonnet 4.6 <noreply@anthropic.com>
</commit_message>
<xml_diff>
--- a/Homework/Exams/ENGL 3110 - S26 - Exam One - Answer Key.docx
+++ b/Homework/Exams/ENGL 3110 - S26 - Exam One - Answer Key.docx
@@ -2761,7 +2761,7 @@
         <w:rPr>
           <w:sz w:val="22"/>
         </w:rPr>
-        <w:t>In the sentence “The professor from the university in Boston retired last spring,” what word does the prepositional phrase “in Boston” modify?</w:t>
+        <w:t>In the sentence “The teacher from the school for wizards retired last spring,” what word does the prepositional phrase “for wizards” modify?</w:t>
       </w:r>
       <w:r>
         <w:rPr>
@@ -2799,14 +2799,14 @@
         <w:rPr>
           <w:sz w:val="22"/>
         </w:rPr>
-        <w:t>a. professor</w:t>
+        <w:t>a. teacher</w:t>
       </w:r>
       <w:r>
         <w:rPr>
           <w:i/>
           <w:sz w:val="20"/>
         </w:rPr>
-        <w:t xml:space="preserve"> — Incorrect. "professor" is the head of the outer NP, modified by the entire PP "from the university in Boston."</w:t>
+        <w:t xml:space="preserve"> — Incorrect. "teacher" is the head of the outer NP, modified by the entire PP "from the school for wizards."</w:t>
       </w:r>
     </w:p>
     <w:p>
@@ -2818,14 +2818,14 @@
         <w:rPr>
           <w:sz w:val="22"/>
         </w:rPr>
-        <w:t>b. spring</w:t>
+        <w:t>b. retired</w:t>
       </w:r>
       <w:r>
         <w:rPr>
           <w:i/>
           <w:sz w:val="20"/>
         </w:rPr>
-        <w:t xml:space="preserve"> — Incorrect. "spring" is a noun in a separate time expression.</w:t>
+        <w:t xml:space="preserve"> — Incorrect. "retired" is the verb; prepositional phrases that modify nouns are nested inside NPs.</w:t>
       </w:r>
     </w:p>
     <w:p>
@@ -2838,14 +2838,14 @@
           <w:b/>
           <w:sz w:val="22"/>
         </w:rPr>
-        <w:t>c. university</w:t>
+        <w:t>c. school</w:t>
       </w:r>
       <w:r>
         <w:rPr>
           <w:i/>
           <w:sz w:val="20"/>
         </w:rPr>
-        <w:t xml:space="preserve"> — Correct. "in Boston" modifies "university" — the head noun of the NP inside the PP "from the university."</w:t>
+        <w:t xml:space="preserve"> — Correct. "for wizards" modifies "school" — the head noun of the NP inside the PP "from the school for wizards."</w:t>
       </w:r>
     </w:p>
     <w:p>
@@ -2857,14 +2857,14 @@
         <w:rPr>
           <w:sz w:val="22"/>
         </w:rPr>
-        <w:t>d. retired</w:t>
+        <w:t>d. spring</w:t>
       </w:r>
       <w:r>
         <w:rPr>
           <w:i/>
           <w:sz w:val="20"/>
         </w:rPr>
-        <w:t xml:space="preserve"> — Incorrect. "retired" is the verb; the PP "in Boston" modifies a noun, not the verb.</w:t>
+        <w:t xml:space="preserve"> — Incorrect. "spring" is a noun in a separate time expression.</w:t>
       </w:r>
     </w:p>
     <w:p>

</xml_diff>